<commit_message>
Actualizacion de actividades en el proyecto
</commit_message>
<xml_diff>
--- a/Evidencias y aportaciones de las evidencias/Aportacion en las evidencias y competencias 1.4.docx
+++ b/Evidencias y aportaciones de las evidencias/Aportacion en las evidencias y competencias 1.4.docx
@@ -198,7 +198,6 @@
           <w:szCs w:val="32"/>
         </w:rPr>
       </w:pPr>
-      <w:proofErr w:type="spellStart"/>
       <w:r>
         <w:rPr>
           <w:rFonts w:ascii="Times New Roman" w:eastAsia="Times New Roman" w:hAnsi="Times New Roman" w:cs="Times New Roman"/>
@@ -206,58 +205,28 @@
           <w:sz w:val="32"/>
           <w:szCs w:val="32"/>
         </w:rPr>
-        <w:t>Construccion</w:t>
-      </w:r>
-      <w:proofErr w:type="spellEnd"/>
-      <w:r>
+        <w:t>Construccion de requisitos de software y toma de decisiones</w:t>
+      </w:r>
+    </w:p>
+    <w:p>
+      <w:pPr>
+        <w:spacing w:after="160" w:line="259" w:lineRule="auto"/>
+        <w:jc w:val="center"/>
         <w:rPr>
           <w:rFonts w:ascii="Times New Roman" w:eastAsia="Times New Roman" w:hAnsi="Times New Roman" w:cs="Times New Roman"/>
           <w:b/>
           <w:sz w:val="32"/>
           <w:szCs w:val="32"/>
         </w:rPr>
-        <w:t xml:space="preserve"> de requisitos de software y toma de decisiones</w:t>
-      </w:r>
-    </w:p>
-    <w:p>
-      <w:pPr>
-        <w:spacing w:after="160" w:line="259" w:lineRule="auto"/>
-        <w:jc w:val="center"/>
+      </w:pPr>
+      <w:r>
         <w:rPr>
           <w:rFonts w:ascii="Times New Roman" w:eastAsia="Times New Roman" w:hAnsi="Times New Roman" w:cs="Times New Roman"/>
           <w:b/>
           <w:sz w:val="32"/>
           <w:szCs w:val="32"/>
         </w:rPr>
-      </w:pPr>
-      <w:r>
-        <w:rPr>
-          <w:rFonts w:ascii="Times New Roman" w:eastAsia="Times New Roman" w:hAnsi="Times New Roman" w:cs="Times New Roman"/>
-          <w:b/>
-          <w:sz w:val="32"/>
-          <w:szCs w:val="32"/>
-        </w:rPr>
-        <w:t xml:space="preserve">                   A01712206 Horacio Villela </w:t>
-      </w:r>
-      <w:proofErr w:type="spellStart"/>
-      <w:r>
-        <w:rPr>
-          <w:rFonts w:ascii="Times New Roman" w:eastAsia="Times New Roman" w:hAnsi="Times New Roman" w:cs="Times New Roman"/>
-          <w:b/>
-          <w:sz w:val="32"/>
-          <w:szCs w:val="32"/>
-        </w:rPr>
-        <w:t>Hdz</w:t>
-      </w:r>
-      <w:proofErr w:type="spellEnd"/>
-      <w:r>
-        <w:rPr>
-          <w:rFonts w:ascii="Times New Roman" w:eastAsia="Times New Roman" w:hAnsi="Times New Roman" w:cs="Times New Roman"/>
-          <w:b/>
-          <w:sz w:val="32"/>
-          <w:szCs w:val="32"/>
-        </w:rPr>
-        <w:t xml:space="preserve"> </w:t>
+        <w:t xml:space="preserve">                   A01712206 Horacio Villela Hdz </w:t>
       </w:r>
       <w:r>
         <w:rPr>
@@ -432,115 +401,7 @@
           <w:szCs w:val="24"/>
         </w:rPr>
         <w:lastRenderedPageBreak/>
-        <w:t xml:space="preserve">Dentro de los requisitos funcionales colabore en tres sectores, el diagrama de casos de </w:t>
-      </w:r>
-      <w:proofErr w:type="gramStart"/>
-      <w:r>
-        <w:rPr>
-          <w:rFonts w:ascii="Times New Roman" w:eastAsia="Times New Roman" w:hAnsi="Times New Roman" w:cs="Times New Roman"/>
-          <w:sz w:val="24"/>
-          <w:szCs w:val="24"/>
-        </w:rPr>
-        <w:t>uso,  los</w:t>
-      </w:r>
-      <w:proofErr w:type="gramEnd"/>
-      <w:r>
-        <w:rPr>
-          <w:rFonts w:ascii="Times New Roman" w:eastAsia="Times New Roman" w:hAnsi="Times New Roman" w:cs="Times New Roman"/>
-          <w:sz w:val="24"/>
-          <w:szCs w:val="24"/>
-        </w:rPr>
-        <w:t xml:space="preserve"> requerimientos y la tabla de priorización de estos. Mi trabajo durante el avance </w:t>
-      </w:r>
-      <w:proofErr w:type="spellStart"/>
-      <w:r>
-        <w:rPr>
-          <w:rFonts w:ascii="Times New Roman" w:eastAsia="Times New Roman" w:hAnsi="Times New Roman" w:cs="Times New Roman"/>
-          <w:sz w:val="24"/>
-          <w:szCs w:val="24"/>
-        </w:rPr>
-        <w:t>a</w:t>
-      </w:r>
-      <w:proofErr w:type="spellEnd"/>
-      <w:r>
-        <w:rPr>
-          <w:rFonts w:ascii="Times New Roman" w:eastAsia="Times New Roman" w:hAnsi="Times New Roman" w:cs="Times New Roman"/>
-          <w:sz w:val="24"/>
-          <w:szCs w:val="24"/>
-        </w:rPr>
-        <w:t xml:space="preserve"> sido la </w:t>
-      </w:r>
-      <w:proofErr w:type="spellStart"/>
-      <w:r>
-        <w:rPr>
-          <w:rFonts w:ascii="Times New Roman" w:eastAsia="Times New Roman" w:hAnsi="Times New Roman" w:cs="Times New Roman"/>
-          <w:sz w:val="24"/>
-          <w:szCs w:val="24"/>
-        </w:rPr>
-        <w:t>modificacion</w:t>
-      </w:r>
-      <w:proofErr w:type="spellEnd"/>
-      <w:r>
-        <w:rPr>
-          <w:rFonts w:ascii="Times New Roman" w:eastAsia="Times New Roman" w:hAnsi="Times New Roman" w:cs="Times New Roman"/>
-          <w:sz w:val="24"/>
-          <w:szCs w:val="24"/>
-        </w:rPr>
-        <w:t xml:space="preserve">, </w:t>
-      </w:r>
-      <w:proofErr w:type="spellStart"/>
-      <w:r>
-        <w:rPr>
-          <w:rFonts w:ascii="Times New Roman" w:eastAsia="Times New Roman" w:hAnsi="Times New Roman" w:cs="Times New Roman"/>
-          <w:sz w:val="24"/>
-          <w:szCs w:val="24"/>
-        </w:rPr>
-        <w:t>correccion</w:t>
-      </w:r>
-      <w:proofErr w:type="spellEnd"/>
-      <w:r>
-        <w:rPr>
-          <w:rFonts w:ascii="Times New Roman" w:eastAsia="Times New Roman" w:hAnsi="Times New Roman" w:cs="Times New Roman"/>
-          <w:sz w:val="24"/>
-          <w:szCs w:val="24"/>
-        </w:rPr>
-        <w:t xml:space="preserve"> y/o </w:t>
-      </w:r>
-      <w:proofErr w:type="spellStart"/>
-      <w:r>
-        <w:rPr>
-          <w:rFonts w:ascii="Times New Roman" w:eastAsia="Times New Roman" w:hAnsi="Times New Roman" w:cs="Times New Roman"/>
-          <w:sz w:val="24"/>
-          <w:szCs w:val="24"/>
-        </w:rPr>
-        <w:t>eliminacion</w:t>
-      </w:r>
-      <w:proofErr w:type="spellEnd"/>
-      <w:r>
-        <w:rPr>
-          <w:rFonts w:ascii="Times New Roman" w:eastAsia="Times New Roman" w:hAnsi="Times New Roman" w:cs="Times New Roman"/>
-          <w:sz w:val="24"/>
-          <w:szCs w:val="24"/>
-        </w:rPr>
-        <w:t xml:space="preserve"> de los distintos requisitos por medio de valuaciones y charlas con los socios formadores, en </w:t>
-      </w:r>
-      <w:proofErr w:type="gramStart"/>
-      <w:r>
-        <w:rPr>
-          <w:rFonts w:ascii="Times New Roman" w:eastAsia="Times New Roman" w:hAnsi="Times New Roman" w:cs="Times New Roman"/>
-          <w:sz w:val="24"/>
-          <w:szCs w:val="24"/>
-        </w:rPr>
-        <w:t>resumen</w:t>
-      </w:r>
-      <w:proofErr w:type="gramEnd"/>
-      <w:r>
-        <w:rPr>
-          <w:rFonts w:ascii="Times New Roman" w:eastAsia="Times New Roman" w:hAnsi="Times New Roman" w:cs="Times New Roman"/>
-          <w:sz w:val="24"/>
-          <w:szCs w:val="24"/>
-        </w:rPr>
-        <w:t xml:space="preserve"> me encargue de los 23 subtipos encontrados de requisitos funcionales siguientes:</w:t>
+        <w:t>Dentro de los requisitos funcionales colabore en tres sectores, el diagrama de casos de uso,  los requerimientos y la tabla de priorización de estos. Mi trabajo durante el avance a sido la modificacion, correccion y/o eliminacion de los distintos requisitos por medio de valuaciones y charlas con los socios formadores, en resumen me encargue de los 23 subtipos encontrados de requisitos funcionales siguientes:</w:t>
       </w:r>
     </w:p>
     <w:p>
@@ -611,25 +472,7 @@
           <w:sz w:val="24"/>
           <w:szCs w:val="24"/>
         </w:rPr>
-        <w:t xml:space="preserve">Cada producto debe contar con al menos tres imágenes en alta resolución con opción de </w:t>
-      </w:r>
-      <w:proofErr w:type="gramStart"/>
-      <w:r>
-        <w:rPr>
-          <w:rFonts w:ascii="Times New Roman" w:eastAsia="Times New Roman" w:hAnsi="Times New Roman" w:cs="Times New Roman"/>
-          <w:sz w:val="24"/>
-          <w:szCs w:val="24"/>
-        </w:rPr>
-        <w:t>zoom</w:t>
-      </w:r>
-      <w:proofErr w:type="gramEnd"/>
-      <w:r>
-        <w:rPr>
-          <w:rFonts w:ascii="Times New Roman" w:eastAsia="Times New Roman" w:hAnsi="Times New Roman" w:cs="Times New Roman"/>
-          <w:sz w:val="24"/>
-          <w:szCs w:val="24"/>
-        </w:rPr>
-        <w:t>.</w:t>
+        <w:t>Cada producto debe contar con al menos tres imágenes en alta resolución con opción de zoom.</w:t>
       </w:r>
     </w:p>
     <w:p>
@@ -2276,25 +2119,7 @@
           <w:sz w:val="24"/>
           <w:szCs w:val="24"/>
         </w:rPr>
-        <w:t xml:space="preserve">Se deben ofrecer varias opciones de envío según la ubicación: estándar y </w:t>
-      </w:r>
-      <w:proofErr w:type="spellStart"/>
-      <w:r>
-        <w:rPr>
-          <w:rFonts w:ascii="Times New Roman" w:eastAsia="Times New Roman" w:hAnsi="Times New Roman" w:cs="Times New Roman"/>
-          <w:sz w:val="24"/>
-          <w:szCs w:val="24"/>
-        </w:rPr>
-        <w:t>express</w:t>
-      </w:r>
-      <w:proofErr w:type="spellEnd"/>
-      <w:r>
-        <w:rPr>
-          <w:rFonts w:ascii="Times New Roman" w:eastAsia="Times New Roman" w:hAnsi="Times New Roman" w:cs="Times New Roman"/>
-          <w:sz w:val="24"/>
-          <w:szCs w:val="24"/>
-        </w:rPr>
-        <w:t>.</w:t>
+        <w:t>Se deben ofrecer varias opciones de envío según la ubicación: estándar y express.</w:t>
       </w:r>
     </w:p>
     <w:p>
@@ -3243,33 +3068,7 @@
     <w:p/>
     <w:p>
       <w:r>
-        <w:t xml:space="preserve">Así mismo mi contribución con la tabla fue similar al apartado pasado, </w:t>
-      </w:r>
-      <w:proofErr w:type="spellStart"/>
-      <w:r>
-        <w:t>encargandome</w:t>
-      </w:r>
-      <w:proofErr w:type="spellEnd"/>
-      <w:r>
-        <w:t xml:space="preserve"> de identificar las distintas </w:t>
-      </w:r>
-      <w:proofErr w:type="gramStart"/>
-      <w:r>
-        <w:t>especificaciones,(</w:t>
-      </w:r>
-      <w:proofErr w:type="gramEnd"/>
-      <w:r>
-        <w:t xml:space="preserve">complejidad, eficiencia, </w:t>
-      </w:r>
-      <w:proofErr w:type="spellStart"/>
-      <w:proofErr w:type="gramStart"/>
-      <w:r>
-        <w:t>durabilidad,etc</w:t>
-      </w:r>
-      <w:proofErr w:type="spellEnd"/>
-      <w:proofErr w:type="gramEnd"/>
-      <w:r>
-        <w:t>) de los requisitos y agruparlos del más importante y complejo hasta el de menor prioridad y sencillo.</w:t>
+        <w:t>Así mismo mi contribución con la tabla fue similar al apartado pasado, encargandome de identificar las distintas especificaciones,(complejidad, eficiencia, durabilidad,etc) de los requisitos y agruparlos del más importante y complejo hasta el de menor prioridad y sencillo.</w:t>
       </w:r>
     </w:p>
     <w:p/>
@@ -3277,93 +3076,13 @@
     <w:p/>
     <w:p>
       <w:r>
-        <w:t xml:space="preserve">Dentro del desarrollo de estos pasos como </w:t>
-      </w:r>
-      <w:proofErr w:type="spellStart"/>
-      <w:r>
-        <w:t>sabran</w:t>
-      </w:r>
-      <w:proofErr w:type="spellEnd"/>
-      <w:r>
-        <w:t xml:space="preserve"> </w:t>
-      </w:r>
-      <w:proofErr w:type="gramStart"/>
-      <w:r>
-        <w:t>hubieron</w:t>
-      </w:r>
-      <w:proofErr w:type="gramEnd"/>
-      <w:r>
-        <w:t xml:space="preserve"> dificultades debido a las nuevas especificaciones de </w:t>
-      </w:r>
-      <w:proofErr w:type="spellStart"/>
-      <w:r>
-        <w:t>socioformadores</w:t>
-      </w:r>
-      <w:proofErr w:type="spellEnd"/>
-      <w:r>
-        <w:t xml:space="preserve"> o incluso cambios en los requisitos previos a los </w:t>
-      </w:r>
-      <w:proofErr w:type="spellStart"/>
-      <w:r>
-        <w:t>mios</w:t>
-      </w:r>
-      <w:proofErr w:type="spellEnd"/>
-      <w:r>
-        <w:t xml:space="preserve">, como reglas de negocio, requisitos de </w:t>
-      </w:r>
-      <w:proofErr w:type="spellStart"/>
-      <w:r>
-        <w:t>informacion</w:t>
-      </w:r>
-      <w:proofErr w:type="spellEnd"/>
-      <w:r>
-        <w:t>, etc.</w:t>
+        <w:t>Dentro del desarrollo de estos pasos como sabran hubieron dificultades debido a las nuevas especificaciones de socioformadores o incluso cambios en los requisitos previos a los mios, como reglas de negocio, requisitos de informacion, etc.</w:t>
       </w:r>
     </w:p>
     <w:p/>
     <w:p>
       <w:r>
-        <w:t xml:space="preserve">Con esto se ha editado por lo menos de 3 a 4 veces los requisitos funcionales hasta el momento, si bien </w:t>
-      </w:r>
-      <w:proofErr w:type="spellStart"/>
-      <w:r>
-        <w:t>tambien</w:t>
-      </w:r>
-      <w:proofErr w:type="spellEnd"/>
-      <w:r>
-        <w:t xml:space="preserve"> ayude a dar forma a los casos de uso, solo </w:t>
-      </w:r>
-      <w:proofErr w:type="spellStart"/>
-      <w:r>
-        <w:t>ejerci</w:t>
-      </w:r>
-      <w:proofErr w:type="spellEnd"/>
-      <w:r>
-        <w:t xml:space="preserve"> </w:t>
-      </w:r>
-      <w:proofErr w:type="spellStart"/>
-      <w:r>
-        <w:t>participacion</w:t>
-      </w:r>
-      <w:proofErr w:type="spellEnd"/>
-      <w:r>
-        <w:t xml:space="preserve"> como comentarista, es decir; brindando recomendaciones a mis compañeros de como los </w:t>
-      </w:r>
-      <w:proofErr w:type="spellStart"/>
-      <w:r>
-        <w:t>estan</w:t>
-      </w:r>
-      <w:proofErr w:type="spellEnd"/>
-      <w:r>
-        <w:t xml:space="preserve"> escribiendo </w:t>
-      </w:r>
-      <w:proofErr w:type="spellStart"/>
-      <w:r>
-        <w:t>asi</w:t>
-      </w:r>
-      <w:proofErr w:type="spellEnd"/>
-      <w:r>
-        <w:t xml:space="preserve"> como en el flujo de estos mismos</w:t>
+        <w:t>Con esto se ha editado por lo menos de 3 a 4 veces los requisitos funcionales hasta el momento, si bien tambien ayude a dar forma a los casos de uso, solo ejerci participacion como comentarista, es decir; brindando recomendaciones a mis compañeros de como los estan escribiendo asi como en el flujo de estos mismos</w:t>
       </w:r>
     </w:p>
     <w:p/>
@@ -3635,23 +3354,13 @@
                 <w:szCs w:val="24"/>
               </w:rPr>
             </w:pPr>
-            <w:proofErr w:type="spellStart"/>
-            <w:r>
-              <w:rPr>
-                <w:rFonts w:ascii="Times New Roman" w:eastAsia="Times New Roman" w:hAnsi="Times New Roman" w:cs="Times New Roman"/>
-                <w:sz w:val="24"/>
-                <w:szCs w:val="24"/>
-              </w:rPr>
-              <w:t>Gestion</w:t>
-            </w:r>
-            <w:proofErr w:type="spellEnd"/>
-            <w:r>
-              <w:rPr>
-                <w:rFonts w:ascii="Times New Roman" w:eastAsia="Times New Roman" w:hAnsi="Times New Roman" w:cs="Times New Roman"/>
-                <w:sz w:val="24"/>
-                <w:szCs w:val="24"/>
-              </w:rPr>
-              <w:t xml:space="preserve"> de Usuarios</w:t>
+            <w:r>
+              <w:rPr>
+                <w:rFonts w:ascii="Times New Roman" w:eastAsia="Times New Roman" w:hAnsi="Times New Roman" w:cs="Times New Roman"/>
+                <w:sz w:val="24"/>
+                <w:szCs w:val="24"/>
+              </w:rPr>
+              <w:t>Gestion de Usuarios</w:t>
             </w:r>
           </w:p>
         </w:tc>
@@ -5500,15 +5209,7 @@
     <w:p/>
     <w:p>
       <w:r>
-        <w:t xml:space="preserve">Mi contribución con este sector fue para detallar qué significa cada requisito agregado y cómo se relaciona con las otras instancias ya puestas. Si bien la </w:t>
-      </w:r>
-      <w:proofErr w:type="gramStart"/>
-      <w:r>
-        <w:t>re edición</w:t>
-      </w:r>
-      <w:proofErr w:type="gramEnd"/>
-      <w:r>
-        <w:t xml:space="preserve"> de los requisitos cambia por obvias razones el cuerpo del proyecto, gracias a las evaluaciones y revisiones con nuestro socio y profe, puede ayudar a enfatizar en las correcciones entre las distintas relaciones o tipo de dato que requiere cada una de estas.</w:t>
+        <w:t>Mi contribución con este sector fue para detallar qué significa cada requisito agregado y cómo se relaciona con las otras instancias ya puestas. Si bien la re edición de los requisitos cambia por obvias razones el cuerpo del proyecto, gracias a las evaluaciones y revisiones con nuestro socio y profe, puede ayudar a enfatizar en las correcciones entre las distintas relaciones o tipo de dato que requiere cada una de estas.</w:t>
       </w:r>
     </w:p>
     <w:p>
@@ -5526,35 +5227,18 @@
           <w:bCs/>
         </w:rPr>
       </w:pPr>
-      <w:proofErr w:type="gramStart"/>
       <w:r>
         <w:rPr>
           <w:b/>
           <w:bCs/>
         </w:rPr>
-        <w:t>Diagrama  de</w:t>
-      </w:r>
-      <w:proofErr w:type="gramEnd"/>
-      <w:r>
-        <w:rPr>
-          <w:b/>
-          <w:bCs/>
-        </w:rPr>
-        <w:t xml:space="preserve"> secuencia</w:t>
+        <w:t>Diagrama  de secuencia</w:t>
       </w:r>
     </w:p>
     <w:p/>
     <w:p>
       <w:r>
-        <w:t xml:space="preserve">Dentro de los </w:t>
-      </w:r>
-      <w:proofErr w:type="spellStart"/>
-      <w:r>
-        <w:t>disagramas</w:t>
-      </w:r>
-      <w:proofErr w:type="spellEnd"/>
-      <w:r>
-        <w:t xml:space="preserve"> de secuencia fue diseñar aquel basado en el caso de uso 2</w:t>
+        <w:t>Dentro de los disagramas de secuencia fue diseñar aquel basado en el caso de uso 2</w:t>
       </w:r>
     </w:p>
     <w:p>
@@ -5563,7 +5247,7 @@
           <w:noProof/>
         </w:rPr>
         <w:drawing>
-          <wp:inline distT="0" distB="0" distL="0" distR="0" wp14:anchorId="2A67C7F8" wp14:editId="0054551C">
+          <wp:inline distT="0" distB="0" distL="0" distR="0" wp14:anchorId="2A67C7F8" wp14:editId="6EEA59FE">
             <wp:extent cx="6297069" cy="3740150"/>
             <wp:effectExtent l="0" t="0" r="8890" b="0"/>
             <wp:docPr id="1382507226" name="Picture 2"/>
@@ -5611,23 +5295,7 @@
     </w:p>
     <w:p>
       <w:r>
-        <w:t xml:space="preserve">Para ello use la plataforma en línea </w:t>
-      </w:r>
-      <w:proofErr w:type="spellStart"/>
-      <w:r>
-        <w:t>plantuml</w:t>
-      </w:r>
-      <w:proofErr w:type="spellEnd"/>
-      <w:r>
-        <w:t xml:space="preserve">, que me ayudo a </w:t>
-      </w:r>
-      <w:proofErr w:type="spellStart"/>
-      <w:r>
-        <w:t>estrructrarlo</w:t>
-      </w:r>
-      <w:proofErr w:type="spellEnd"/>
-      <w:r>
-        <w:t xml:space="preserve"> de una manera uniforme y formal, en este apartado mostrare el script que use para el diagrama</w:t>
+        <w:t>Para ello use la plataforma en línea plantuml, que me ayudo a estrructrarlo de una manera uniforme y formal, en este apartado mostrare el script que use para el diagrama</w:t>
       </w:r>
     </w:p>
     <w:p/>
@@ -5653,126 +5321,49 @@
       </w:r>
     </w:p>
     <w:p>
-      <w:proofErr w:type="spellStart"/>
-      <w:r>
-        <w:t>participant</w:t>
-      </w:r>
-      <w:proofErr w:type="spellEnd"/>
-      <w:r>
-        <w:t xml:space="preserve"> "Cliente Web (Navegador)" as Browser</w:t>
-      </w:r>
-    </w:p>
-    <w:p>
-      <w:proofErr w:type="spellStart"/>
-      <w:r>
-        <w:t>participant</w:t>
-      </w:r>
-      <w:proofErr w:type="spellEnd"/>
-      <w:r>
-        <w:t xml:space="preserve"> "Servidor Web" as Server</w:t>
-      </w:r>
-    </w:p>
-    <w:p>
-      <w:proofErr w:type="spellStart"/>
-      <w:r>
-        <w:t>participant</w:t>
-      </w:r>
-      <w:proofErr w:type="spellEnd"/>
-      <w:r>
-        <w:t xml:space="preserve"> "Controlador de Autenticación" as </w:t>
-      </w:r>
-      <w:proofErr w:type="spellStart"/>
-      <w:r>
-        <w:t>AuthController</w:t>
-      </w:r>
-      <w:proofErr w:type="spellEnd"/>
-    </w:p>
-    <w:p>
-      <w:proofErr w:type="spellStart"/>
-      <w:r>
-        <w:t>participant</w:t>
-      </w:r>
-      <w:proofErr w:type="spellEnd"/>
-      <w:r>
-        <w:t xml:space="preserve"> "Base de Datos" as DB</w:t>
-      </w:r>
-    </w:p>
-    <w:p>
-      <w:proofErr w:type="spellStart"/>
-      <w:r>
-        <w:t>participant</w:t>
-      </w:r>
-      <w:proofErr w:type="spellEnd"/>
-      <w:r>
-        <w:t xml:space="preserve"> "Gestor de Sesiones" as </w:t>
-      </w:r>
-      <w:proofErr w:type="spellStart"/>
-      <w:r>
-        <w:t>SessionManager</w:t>
-      </w:r>
-      <w:proofErr w:type="spellEnd"/>
+      <w:r>
+        <w:t>participant "Cliente Web (Navegador)" as Browser</w:t>
+      </w:r>
+    </w:p>
+    <w:p>
+      <w:r>
+        <w:t>participant "Servidor Web" as Server</w:t>
+      </w:r>
+    </w:p>
+    <w:p>
+      <w:r>
+        <w:t>participant "Controlador de Autenticación" as AuthController</w:t>
+      </w:r>
+    </w:p>
+    <w:p>
+      <w:r>
+        <w:t>participant "Base de Datos" as DB</w:t>
+      </w:r>
+    </w:p>
+    <w:p>
+      <w:r>
+        <w:t>participant "Gestor de Sesiones" as SessionManager</w:t>
+      </w:r>
     </w:p>
     <w:p/>
     <w:p>
       <w:r>
-        <w:t xml:space="preserve">== Mostrar Formulario de </w:t>
-      </w:r>
-      <w:proofErr w:type="spellStart"/>
-      <w:r>
-        <w:t>Login</w:t>
-      </w:r>
-      <w:proofErr w:type="spellEnd"/>
-      <w:r>
-        <w:t xml:space="preserve"> ==</w:t>
-      </w:r>
-    </w:p>
-    <w:p>
-      <w:r>
-        <w:t xml:space="preserve">Usuario -&gt; </w:t>
-      </w:r>
-      <w:proofErr w:type="gramStart"/>
-      <w:r>
-        <w:t>Browser :</w:t>
-      </w:r>
-      <w:proofErr w:type="gramEnd"/>
-      <w:r>
-        <w:t xml:space="preserve"> Abre /</w:t>
-      </w:r>
-      <w:proofErr w:type="spellStart"/>
-      <w:r>
-        <w:t>login</w:t>
-      </w:r>
-      <w:proofErr w:type="spellEnd"/>
-    </w:p>
-    <w:p>
-      <w:r>
-        <w:t xml:space="preserve">Browser -&gt; </w:t>
-      </w:r>
-      <w:proofErr w:type="gramStart"/>
-      <w:r>
-        <w:t>Server :</w:t>
-      </w:r>
-      <w:proofErr w:type="gramEnd"/>
-      <w:r>
-        <w:t xml:space="preserve"> GET /</w:t>
-      </w:r>
-      <w:proofErr w:type="spellStart"/>
-      <w:r>
-        <w:t>login</w:t>
-      </w:r>
-      <w:proofErr w:type="spellEnd"/>
-    </w:p>
-    <w:p>
-      <w:r>
-        <w:t xml:space="preserve">Server --&gt; </w:t>
-      </w:r>
-      <w:proofErr w:type="gramStart"/>
-      <w:r>
-        <w:t>Browser :</w:t>
-      </w:r>
-      <w:proofErr w:type="gramEnd"/>
-      <w:r>
-        <w:t xml:space="preserve"> Formulario de inicio de sesión (HTML)</w:t>
+        <w:t>== Mostrar Formulario de Login ==</w:t>
+      </w:r>
+    </w:p>
+    <w:p>
+      <w:r>
+        <w:t>Usuario -&gt; Browser : Abre /login</w:t>
+      </w:r>
+    </w:p>
+    <w:p>
+      <w:r>
+        <w:t>Browser -&gt; Server : GET /login</w:t>
+      </w:r>
+    </w:p>
+    <w:p>
+      <w:r>
+        <w:t>Server --&gt; Browser : Formulario de inicio de sesión (HTML)</w:t>
       </w:r>
     </w:p>
     <w:p/>
@@ -5783,624 +5374,177 @@
     </w:p>
     <w:p>
       <w:r>
-        <w:t xml:space="preserve">Usuario -&gt; </w:t>
-      </w:r>
-      <w:proofErr w:type="gramStart"/>
-      <w:r>
-        <w:t>Browser :</w:t>
-      </w:r>
-      <w:proofErr w:type="gramEnd"/>
-      <w:r>
-        <w:t xml:space="preserve"> Ingresa usuario y contraseña</w:t>
-      </w:r>
-    </w:p>
-    <w:p>
-      <w:r>
-        <w:t xml:space="preserve">Browser -&gt; </w:t>
-      </w:r>
-      <w:proofErr w:type="gramStart"/>
-      <w:r>
-        <w:t>Server :</w:t>
-      </w:r>
-      <w:proofErr w:type="gramEnd"/>
-      <w:r>
-        <w:t xml:space="preserve"> POST /</w:t>
-      </w:r>
-      <w:proofErr w:type="spellStart"/>
-      <w:r>
-        <w:t>login</w:t>
-      </w:r>
-      <w:proofErr w:type="spellEnd"/>
-      <w:r>
-        <w:t xml:space="preserve"> (usuario, contraseña)</w:t>
+        <w:t>Usuario -&gt; Browser : Ingresa usuario y contraseña</w:t>
+      </w:r>
+    </w:p>
+    <w:p>
+      <w:r>
+        <w:t>Browser -&gt; Server : POST /login (usuario, contraseña)</w:t>
       </w:r>
     </w:p>
     <w:p/>
     <w:p>
       <w:r>
-        <w:t xml:space="preserve">Server -&gt; </w:t>
-      </w:r>
-      <w:proofErr w:type="spellStart"/>
-      <w:proofErr w:type="gramStart"/>
-      <w:r>
-        <w:t>AuthController</w:t>
-      </w:r>
-      <w:proofErr w:type="spellEnd"/>
-      <w:r>
-        <w:t xml:space="preserve"> :</w:t>
-      </w:r>
-      <w:proofErr w:type="gramEnd"/>
-      <w:r>
-        <w:t xml:space="preserve"> </w:t>
-      </w:r>
-      <w:proofErr w:type="spellStart"/>
-      <w:proofErr w:type="gramStart"/>
-      <w:r>
-        <w:t>autenticarUsuario</w:t>
-      </w:r>
-      <w:proofErr w:type="spellEnd"/>
-      <w:r>
-        <w:t>(</w:t>
-      </w:r>
-      <w:proofErr w:type="gramEnd"/>
-      <w:r>
-        <w:t>usuario, contraseña)</w:t>
-      </w:r>
-    </w:p>
-    <w:p>
-      <w:proofErr w:type="spellStart"/>
-      <w:r>
-        <w:t>AuthController</w:t>
-      </w:r>
-      <w:proofErr w:type="spellEnd"/>
-      <w:r>
-        <w:t xml:space="preserve"> -&gt; </w:t>
-      </w:r>
-      <w:proofErr w:type="gramStart"/>
-      <w:r>
-        <w:t>DB :</w:t>
-      </w:r>
-      <w:proofErr w:type="gramEnd"/>
-      <w:r>
-        <w:t xml:space="preserve"> </w:t>
-      </w:r>
-      <w:proofErr w:type="spellStart"/>
-      <w:r>
-        <w:t>obtenerUsuarioPorNombre</w:t>
-      </w:r>
-      <w:proofErr w:type="spellEnd"/>
-      <w:r>
-        <w:t>(usuario)</w:t>
-      </w:r>
-    </w:p>
-    <w:p>
-      <w:r>
-        <w:t xml:space="preserve">DB --&gt; </w:t>
-      </w:r>
-      <w:proofErr w:type="spellStart"/>
-      <w:proofErr w:type="gramStart"/>
-      <w:r>
-        <w:t>AuthController</w:t>
-      </w:r>
-      <w:proofErr w:type="spellEnd"/>
-      <w:r>
-        <w:t xml:space="preserve"> :</w:t>
-      </w:r>
-      <w:proofErr w:type="gramEnd"/>
-      <w:r>
-        <w:t xml:space="preserve"> </w:t>
-      </w:r>
-      <w:proofErr w:type="spellStart"/>
-      <w:r>
-        <w:t>datosUsuario</w:t>
-      </w:r>
-      <w:proofErr w:type="spellEnd"/>
+        <w:t>Server -&gt; AuthController : autenticarUsuario(usuario, contraseña)</w:t>
+      </w:r>
+    </w:p>
+    <w:p>
+      <w:r>
+        <w:t>AuthController -&gt; DB : obtenerUsuarioPorNombre(usuario)</w:t>
+      </w:r>
+    </w:p>
+    <w:p>
+      <w:r>
+        <w:t>DB --&gt; AuthController : datosUsuario</w:t>
+      </w:r>
     </w:p>
     <w:p/>
     <w:p>
-      <w:proofErr w:type="spellStart"/>
-      <w:r>
-        <w:t>AuthController</w:t>
-      </w:r>
-      <w:proofErr w:type="spellEnd"/>
-      <w:r>
-        <w:t xml:space="preserve"> -&gt; </w:t>
-      </w:r>
-      <w:proofErr w:type="spellStart"/>
-      <w:proofErr w:type="gramStart"/>
-      <w:r>
-        <w:t>AuthController</w:t>
-      </w:r>
-      <w:proofErr w:type="spellEnd"/>
-      <w:r>
-        <w:t xml:space="preserve"> :</w:t>
-      </w:r>
-      <w:proofErr w:type="gramEnd"/>
-      <w:r>
-        <w:t xml:space="preserve"> </w:t>
-      </w:r>
-      <w:proofErr w:type="spellStart"/>
-      <w:proofErr w:type="gramStart"/>
-      <w:r>
-        <w:t>verificarContraseña</w:t>
-      </w:r>
-      <w:proofErr w:type="spellEnd"/>
-      <w:r>
-        <w:t>(</w:t>
-      </w:r>
-      <w:proofErr w:type="gramEnd"/>
-      <w:r>
-        <w:t>ingresada, almacenada)</w:t>
+      <w:r>
+        <w:t>AuthController -&gt; AuthController : verificarContraseña(ingresada, almacenada)</w:t>
       </w:r>
     </w:p>
     <w:p/>
     <w:p>
-      <w:proofErr w:type="spellStart"/>
-      <w:r>
-        <w:t>alt</w:t>
-      </w:r>
-      <w:proofErr w:type="spellEnd"/>
-      <w:r>
-        <w:t xml:space="preserve"> Contraseña válida</w:t>
-      </w:r>
-    </w:p>
-    <w:p>
+      <w:r>
+        <w:t>alt Contraseña válida</w:t>
+      </w:r>
+    </w:p>
+    <w:p>
+      <w:r>
+        <w:t xml:space="preserve">    AuthController -&gt; SessionManager : obtenerSesionActiva(usuarioId)</w:t>
+      </w:r>
+    </w:p>
+    <w:p>
+      <w:r>
+        <w:t xml:space="preserve">    alt Sesión activa encontrada</w:t>
+      </w:r>
+    </w:p>
+    <w:p>
+      <w:r>
+        <w:t xml:space="preserve">        SessionManager -&gt; SessionManager : cerrarSesionAnterior(usuarioId)</w:t>
+      </w:r>
+    </w:p>
+    <w:p>
+      <w:pPr>
+        <w:rPr>
+          <w:lang w:val="en-US"/>
+        </w:rPr>
+      </w:pPr>
       <w:r>
         <w:t xml:space="preserve">    </w:t>
       </w:r>
-      <w:proofErr w:type="spellStart"/>
-      <w:r>
-        <w:t>AuthController</w:t>
-      </w:r>
-      <w:proofErr w:type="spellEnd"/>
-      <w:r>
-        <w:t xml:space="preserve"> -&gt; </w:t>
-      </w:r>
-      <w:proofErr w:type="spellStart"/>
-      <w:proofErr w:type="gramStart"/>
-      <w:r>
-        <w:t>SessionManager</w:t>
-      </w:r>
-      <w:proofErr w:type="spellEnd"/>
-      <w:r>
-        <w:t xml:space="preserve"> :</w:t>
-      </w:r>
-      <w:proofErr w:type="gramEnd"/>
-      <w:r>
-        <w:t xml:space="preserve"> </w:t>
-      </w:r>
-      <w:proofErr w:type="spellStart"/>
-      <w:r>
-        <w:t>obtenerSesionActiva</w:t>
-      </w:r>
-      <w:proofErr w:type="spellEnd"/>
-      <w:r>
-        <w:t>(</w:t>
-      </w:r>
-      <w:proofErr w:type="spellStart"/>
-      <w:r>
-        <w:t>usuarioId</w:t>
-      </w:r>
-      <w:proofErr w:type="spellEnd"/>
-      <w:r>
-        <w:t>)</w:t>
-      </w:r>
-    </w:p>
-    <w:p>
-      <w:r>
+      <w:r>
+        <w:rPr>
+          <w:lang w:val="en-US"/>
+        </w:rPr>
+        <w:t>end</w:t>
+      </w:r>
+    </w:p>
+    <w:p>
+      <w:pPr>
+        <w:rPr>
+          <w:lang w:val="en-US"/>
+        </w:rPr>
+      </w:pPr>
+      <w:r>
+        <w:rPr>
+          <w:lang w:val="en-US"/>
+        </w:rPr>
+        <w:t xml:space="preserve">    AuthController -&gt; SessionManager : crearSesion(usuarioId, dispositivo)</w:t>
+      </w:r>
+    </w:p>
+    <w:p>
+      <w:pPr>
+        <w:rPr>
+          <w:lang w:val="es-MX"/>
+        </w:rPr>
+      </w:pPr>
+      <w:r>
+        <w:rPr>
+          <w:lang w:val="en-US"/>
+        </w:rPr>
         <w:t xml:space="preserve">    </w:t>
       </w:r>
-      <w:proofErr w:type="spellStart"/>
-      <w:r>
-        <w:t>alt</w:t>
-      </w:r>
-      <w:proofErr w:type="spellEnd"/>
-      <w:r>
-        <w:t xml:space="preserve"> Sesión activa encontrada</w:t>
-      </w:r>
-    </w:p>
-    <w:p>
-      <w:r>
-        <w:t xml:space="preserve">        </w:t>
-      </w:r>
-      <w:proofErr w:type="spellStart"/>
-      <w:r>
-        <w:t>SessionManager</w:t>
-      </w:r>
-      <w:proofErr w:type="spellEnd"/>
-      <w:r>
-        <w:t xml:space="preserve"> -&gt; </w:t>
-      </w:r>
-      <w:proofErr w:type="spellStart"/>
-      <w:proofErr w:type="gramStart"/>
-      <w:r>
-        <w:t>SessionManager</w:t>
-      </w:r>
-      <w:proofErr w:type="spellEnd"/>
-      <w:r>
-        <w:t xml:space="preserve"> :</w:t>
-      </w:r>
-      <w:proofErr w:type="gramEnd"/>
-      <w:r>
-        <w:t xml:space="preserve"> </w:t>
-      </w:r>
-      <w:proofErr w:type="spellStart"/>
-      <w:r>
-        <w:t>cerrarSesionAnterior</w:t>
-      </w:r>
-      <w:proofErr w:type="spellEnd"/>
-      <w:r>
-        <w:t>(</w:t>
-      </w:r>
-      <w:proofErr w:type="spellStart"/>
-      <w:r>
-        <w:t>usuarioId</w:t>
-      </w:r>
-      <w:proofErr w:type="spellEnd"/>
-      <w:r>
-        <w:t>)</w:t>
-      </w:r>
-    </w:p>
-    <w:p>
-      <w:pPr>
-        <w:rPr>
-          <w:lang w:val="en-US"/>
-        </w:rPr>
-      </w:pPr>
-      <w:r>
-        <w:t xml:space="preserve">    </w:t>
-      </w:r>
-      <w:r>
-        <w:rPr>
-          <w:lang w:val="en-US"/>
-        </w:rPr>
+      <w:r>
+        <w:rPr>
+          <w:lang w:val="es-MX"/>
+        </w:rPr>
+        <w:t>SessionManager --&gt; AuthController : sesionCreada</w:t>
+      </w:r>
+    </w:p>
+    <w:p>
+      <w:pPr>
+        <w:rPr>
+          <w:lang w:val="es-MX"/>
+        </w:rPr>
+      </w:pPr>
+    </w:p>
+    <w:p>
+      <w:pPr>
+        <w:rPr>
+          <w:lang w:val="es-MX"/>
+        </w:rPr>
+      </w:pPr>
+      <w:r>
+        <w:rPr>
+          <w:lang w:val="es-MX"/>
+        </w:rPr>
+        <w:t xml:space="preserve">    AuthController --&gt; Server : respuesta 200 OK (redireccionar a dashboard)</w:t>
+      </w:r>
+    </w:p>
+    <w:p>
+      <w:pPr>
+        <w:rPr>
+          <w:lang w:val="es-MX"/>
+        </w:rPr>
+      </w:pPr>
+      <w:r>
+        <w:rPr>
+          <w:lang w:val="es-MX"/>
+        </w:rPr>
+        <w:t xml:space="preserve">    Server --&gt; Browser : Redirección a /dashboard</w:t>
+      </w:r>
+    </w:p>
+    <w:p>
+      <w:pPr>
+        <w:rPr>
+          <w:lang w:val="es-MX"/>
+        </w:rPr>
+      </w:pPr>
+      <w:r>
+        <w:rPr>
+          <w:lang w:val="es-MX"/>
+        </w:rPr>
+        <w:t xml:space="preserve">    Browser -&gt; Usuario : Plataforma accesible</w:t>
+      </w:r>
+    </w:p>
+    <w:p>
+      <w:r>
+        <w:t>else Contraseña incorrecta</w:t>
+      </w:r>
+    </w:p>
+    <w:p>
+      <w:r>
+        <w:t xml:space="preserve">    AuthController --&gt; Server : respuesta 401 Unauthorized</w:t>
+      </w:r>
+    </w:p>
+    <w:p>
+      <w:r>
+        <w:t xml:space="preserve">    Server --&gt; Browser : Mostrar mensaje de error</w:t>
+      </w:r>
+    </w:p>
+    <w:p>
+      <w:r>
+        <w:t xml:space="preserve">    Browser -&gt; Usuario : "Credenciales inválidas"</w:t>
+      </w:r>
+    </w:p>
+    <w:p>
+      <w:r>
         <w:t>end</w:t>
       </w:r>
     </w:p>
     <w:p>
-      <w:pPr>
-        <w:rPr>
-          <w:lang w:val="en-US"/>
-        </w:rPr>
-      </w:pPr>
-      <w:r>
-        <w:rPr>
-          <w:lang w:val="en-US"/>
-        </w:rPr>
-        <w:t xml:space="preserve">    </w:t>
-      </w:r>
-      <w:proofErr w:type="spellStart"/>
-      <w:r>
-        <w:rPr>
-          <w:lang w:val="en-US"/>
-        </w:rPr>
-        <w:t>AuthController</w:t>
-      </w:r>
-      <w:proofErr w:type="spellEnd"/>
-      <w:r>
-        <w:rPr>
-          <w:lang w:val="en-US"/>
-        </w:rPr>
-        <w:t xml:space="preserve"> -&gt; </w:t>
-      </w:r>
-      <w:proofErr w:type="spellStart"/>
-      <w:proofErr w:type="gramStart"/>
-      <w:r>
-        <w:rPr>
-          <w:lang w:val="en-US"/>
-        </w:rPr>
-        <w:t>SessionManager</w:t>
-      </w:r>
-      <w:proofErr w:type="spellEnd"/>
-      <w:r>
-        <w:rPr>
-          <w:lang w:val="en-US"/>
-        </w:rPr>
-        <w:t xml:space="preserve"> :</w:t>
-      </w:r>
-      <w:proofErr w:type="gramEnd"/>
-      <w:r>
-        <w:rPr>
-          <w:lang w:val="en-US"/>
-        </w:rPr>
-        <w:t xml:space="preserve"> </w:t>
-      </w:r>
-      <w:proofErr w:type="spellStart"/>
-      <w:proofErr w:type="gramStart"/>
-      <w:r>
-        <w:rPr>
-          <w:lang w:val="en-US"/>
-        </w:rPr>
-        <w:t>crearSesion</w:t>
-      </w:r>
-      <w:proofErr w:type="spellEnd"/>
-      <w:r>
-        <w:rPr>
-          <w:lang w:val="en-US"/>
-        </w:rPr>
-        <w:t>(</w:t>
-      </w:r>
-      <w:proofErr w:type="spellStart"/>
-      <w:proofErr w:type="gramEnd"/>
-      <w:r>
-        <w:rPr>
-          <w:lang w:val="en-US"/>
-        </w:rPr>
-        <w:t>usuarioId</w:t>
-      </w:r>
-      <w:proofErr w:type="spellEnd"/>
-      <w:r>
-        <w:rPr>
-          <w:lang w:val="en-US"/>
-        </w:rPr>
-        <w:t xml:space="preserve">, </w:t>
-      </w:r>
-      <w:proofErr w:type="spellStart"/>
-      <w:r>
-        <w:rPr>
-          <w:lang w:val="en-US"/>
-        </w:rPr>
-        <w:t>dispositivo</w:t>
-      </w:r>
-      <w:proofErr w:type="spellEnd"/>
-      <w:r>
-        <w:rPr>
-          <w:lang w:val="en-US"/>
-        </w:rPr>
-        <w:t>)</w:t>
-      </w:r>
-    </w:p>
-    <w:p>
-      <w:pPr>
-        <w:rPr>
-          <w:lang w:val="es-MX"/>
-        </w:rPr>
-      </w:pPr>
-      <w:r>
-        <w:rPr>
-          <w:lang w:val="en-US"/>
-        </w:rPr>
-        <w:t xml:space="preserve">    </w:t>
-      </w:r>
-      <w:proofErr w:type="spellStart"/>
-      <w:r>
-        <w:rPr>
-          <w:lang w:val="es-MX"/>
-        </w:rPr>
-        <w:t>SessionManager</w:t>
-      </w:r>
-      <w:proofErr w:type="spellEnd"/>
-      <w:r>
-        <w:rPr>
-          <w:lang w:val="es-MX"/>
-        </w:rPr>
-        <w:t xml:space="preserve"> --&gt; </w:t>
-      </w:r>
-      <w:proofErr w:type="spellStart"/>
-      <w:proofErr w:type="gramStart"/>
-      <w:r>
-        <w:rPr>
-          <w:lang w:val="es-MX"/>
-        </w:rPr>
-        <w:t>AuthController</w:t>
-      </w:r>
-      <w:proofErr w:type="spellEnd"/>
-      <w:r>
-        <w:rPr>
-          <w:lang w:val="es-MX"/>
-        </w:rPr>
-        <w:t xml:space="preserve"> :</w:t>
-      </w:r>
-      <w:proofErr w:type="gramEnd"/>
-      <w:r>
-        <w:rPr>
-          <w:lang w:val="es-MX"/>
-        </w:rPr>
-        <w:t xml:space="preserve"> </w:t>
-      </w:r>
-      <w:proofErr w:type="spellStart"/>
-      <w:r>
-        <w:rPr>
-          <w:lang w:val="es-MX"/>
-        </w:rPr>
-        <w:t>sesionCreada</w:t>
-      </w:r>
-      <w:proofErr w:type="spellEnd"/>
-    </w:p>
-    <w:p>
-      <w:pPr>
-        <w:rPr>
-          <w:lang w:val="es-MX"/>
-        </w:rPr>
-      </w:pPr>
-    </w:p>
-    <w:p>
-      <w:pPr>
-        <w:rPr>
-          <w:lang w:val="es-MX"/>
-        </w:rPr>
-      </w:pPr>
-      <w:r>
-        <w:rPr>
-          <w:lang w:val="es-MX"/>
-        </w:rPr>
-        <w:t xml:space="preserve">    </w:t>
-      </w:r>
-      <w:proofErr w:type="spellStart"/>
-      <w:r>
-        <w:rPr>
-          <w:lang w:val="es-MX"/>
-        </w:rPr>
-        <w:t>AuthController</w:t>
-      </w:r>
-      <w:proofErr w:type="spellEnd"/>
-      <w:r>
-        <w:rPr>
-          <w:lang w:val="es-MX"/>
-        </w:rPr>
-        <w:t xml:space="preserve"> --&gt; </w:t>
-      </w:r>
-      <w:proofErr w:type="gramStart"/>
-      <w:r>
-        <w:rPr>
-          <w:lang w:val="es-MX"/>
-        </w:rPr>
-        <w:t>Server :</w:t>
-      </w:r>
-      <w:proofErr w:type="gramEnd"/>
-      <w:r>
-        <w:rPr>
-          <w:lang w:val="es-MX"/>
-        </w:rPr>
-        <w:t xml:space="preserve"> respuesta 200 OK (redireccionar a </w:t>
-      </w:r>
-      <w:proofErr w:type="spellStart"/>
-      <w:r>
-        <w:rPr>
-          <w:lang w:val="es-MX"/>
-        </w:rPr>
-        <w:t>dashboard</w:t>
-      </w:r>
-      <w:proofErr w:type="spellEnd"/>
-      <w:r>
-        <w:rPr>
-          <w:lang w:val="es-MX"/>
-        </w:rPr>
-        <w:t>)</w:t>
-      </w:r>
-    </w:p>
-    <w:p>
-      <w:pPr>
-        <w:rPr>
-          <w:lang w:val="es-MX"/>
-        </w:rPr>
-      </w:pPr>
-      <w:r>
-        <w:rPr>
-          <w:lang w:val="es-MX"/>
-        </w:rPr>
-        <w:t xml:space="preserve">    Server --&gt; </w:t>
-      </w:r>
-      <w:proofErr w:type="gramStart"/>
-      <w:r>
-        <w:rPr>
-          <w:lang w:val="es-MX"/>
-        </w:rPr>
-        <w:t>Browser :</w:t>
-      </w:r>
-      <w:proofErr w:type="gramEnd"/>
-      <w:r>
-        <w:rPr>
-          <w:lang w:val="es-MX"/>
-        </w:rPr>
-        <w:t xml:space="preserve"> Redirección a /</w:t>
-      </w:r>
-      <w:proofErr w:type="spellStart"/>
-      <w:r>
-        <w:rPr>
-          <w:lang w:val="es-MX"/>
-        </w:rPr>
-        <w:t>dashboard</w:t>
-      </w:r>
-      <w:proofErr w:type="spellEnd"/>
-    </w:p>
-    <w:p>
-      <w:pPr>
-        <w:rPr>
-          <w:lang w:val="es-MX"/>
-        </w:rPr>
-      </w:pPr>
-      <w:r>
-        <w:rPr>
-          <w:lang w:val="es-MX"/>
-        </w:rPr>
-        <w:t xml:space="preserve">    Browser -&gt; </w:t>
-      </w:r>
-      <w:proofErr w:type="gramStart"/>
-      <w:r>
-        <w:rPr>
-          <w:lang w:val="es-MX"/>
-        </w:rPr>
-        <w:t>Usuario :</w:t>
-      </w:r>
-      <w:proofErr w:type="gramEnd"/>
-      <w:r>
-        <w:rPr>
-          <w:lang w:val="es-MX"/>
-        </w:rPr>
-        <w:t xml:space="preserve"> Plataforma accesible</w:t>
-      </w:r>
-    </w:p>
-    <w:p>
-      <w:proofErr w:type="spellStart"/>
-      <w:r>
-        <w:t>else</w:t>
-      </w:r>
-      <w:proofErr w:type="spellEnd"/>
-      <w:r>
-        <w:t xml:space="preserve"> Contraseña incorrecta</w:t>
-      </w:r>
-    </w:p>
-    <w:p>
-      <w:r>
-        <w:t xml:space="preserve">    </w:t>
-      </w:r>
-      <w:proofErr w:type="spellStart"/>
-      <w:r>
-        <w:t>AuthController</w:t>
-      </w:r>
-      <w:proofErr w:type="spellEnd"/>
-      <w:r>
-        <w:t xml:space="preserve"> --&gt; </w:t>
-      </w:r>
-      <w:proofErr w:type="gramStart"/>
-      <w:r>
-        <w:t>Server :</w:t>
-      </w:r>
-      <w:proofErr w:type="gramEnd"/>
-      <w:r>
-        <w:t xml:space="preserve"> respuesta 401 </w:t>
-      </w:r>
-      <w:proofErr w:type="spellStart"/>
-      <w:r>
-        <w:t>Unauthorized</w:t>
-      </w:r>
-      <w:proofErr w:type="spellEnd"/>
-    </w:p>
-    <w:p>
-      <w:r>
-        <w:t xml:space="preserve">    Server --&gt; </w:t>
-      </w:r>
-      <w:proofErr w:type="gramStart"/>
-      <w:r>
-        <w:t>Browser :</w:t>
-      </w:r>
-      <w:proofErr w:type="gramEnd"/>
-      <w:r>
-        <w:t xml:space="preserve"> Mostrar mensaje de error</w:t>
-      </w:r>
-    </w:p>
-    <w:p>
-      <w:r>
-        <w:t xml:space="preserve">    Browser -&gt; </w:t>
-      </w:r>
-      <w:proofErr w:type="gramStart"/>
-      <w:r>
-        <w:t>Usuario :</w:t>
-      </w:r>
-      <w:proofErr w:type="gramEnd"/>
-      <w:r>
-        <w:t xml:space="preserve"> "Credenciales inválidas"</w:t>
-      </w:r>
-    </w:p>
-    <w:p>
-      <w:proofErr w:type="spellStart"/>
-      <w:r>
-        <w:t>end</w:t>
-      </w:r>
-      <w:proofErr w:type="spellEnd"/>
-    </w:p>
-    <w:p>
       <w:r>
         <w:t>@enduml</w:t>
       </w:r>
@@ -6421,51 +5565,14 @@
     </w:p>
     <w:p>
       <w:r>
-        <w:t xml:space="preserve">Como cara del equipo mi trabajo es el contacto con el socio formador en caso de dudas o nuevos aportes para el proyecto, a su vez la creación del plan de trabajo y la </w:t>
-      </w:r>
-      <w:proofErr w:type="gramStart"/>
-      <w:r>
-        <w:t>planificación  de</w:t>
-      </w:r>
-      <w:proofErr w:type="gramEnd"/>
-      <w:r>
-        <w:t xml:space="preserve"> comunicación entre los integrantes fue parcialmente diseñado por </w:t>
-      </w:r>
-      <w:proofErr w:type="spellStart"/>
-      <w:r>
-        <w:t>mi</w:t>
-      </w:r>
-      <w:proofErr w:type="spellEnd"/>
-      <w:r>
-        <w:t>. Hago énfasis en parcialmente debido a que se necesita la aceptación de cada uno de los integrantes para su realización.</w:t>
+        <w:t>Como cara del equipo mi trabajo es el contacto con el socio formador en caso de dudas o nuevos aportes para el proyecto, a su vez la creación del plan de trabajo y la planificación  de comunicación entre los integrantes fue parcialmente diseñado por mi. Hago énfasis en parcialmente debido a que se necesita la aceptación de cada uno de los integrantes para su realización.</w:t>
       </w:r>
     </w:p>
     <w:p/>
     <w:p>
-      <w:proofErr w:type="spellStart"/>
       <w:r>
         <w:lastRenderedPageBreak/>
-        <w:t>Aqui</w:t>
-      </w:r>
-      <w:proofErr w:type="spellEnd"/>
-      <w:r>
-        <w:t xml:space="preserve"> </w:t>
-      </w:r>
-      <w:proofErr w:type="spellStart"/>
-      <w:r>
-        <w:t>esta</w:t>
-      </w:r>
-      <w:proofErr w:type="spellEnd"/>
-      <w:r>
-        <w:t xml:space="preserve"> el </w:t>
-      </w:r>
-      <w:proofErr w:type="spellStart"/>
-      <w:r>
-        <w:t>excel</w:t>
-      </w:r>
-      <w:proofErr w:type="spellEnd"/>
-      <w:r>
-        <w:t xml:space="preserve"> de el plan actual de trabajo</w:t>
+        <w:t>Aqui esta el excel de el plan actual de trabajo</w:t>
       </w:r>
     </w:p>
     <w:p>
@@ -6482,21 +5589,8 @@
     <w:p/>
     <w:p>
       <w:r>
-        <w:t xml:space="preserve">Y </w:t>
-      </w:r>
-      <w:proofErr w:type="spellStart"/>
-      <w:r>
-        <w:t>aqui</w:t>
-      </w:r>
-      <w:proofErr w:type="spellEnd"/>
-      <w:r>
-        <w:t xml:space="preserve"> se encuentra parte de las conversaciones que mantenemos como equipo con el </w:t>
-      </w:r>
-      <w:proofErr w:type="spellStart"/>
-      <w:r>
-        <w:t>socioformador</w:t>
-      </w:r>
-      <w:proofErr w:type="spellEnd"/>
+        <w:t>Y aqui se encuentra parte de las conversaciones que mantenemos como equipo con el socioformador</w:t>
+      </w:r>
     </w:p>
     <w:p/>
     <w:p>
@@ -6632,50 +5726,14 @@
         <w:rPr>
           <w:lang w:val="es-MX"/>
         </w:rPr>
-        <w:t xml:space="preserve">Dentro del </w:t>
-      </w:r>
-      <w:proofErr w:type="spellStart"/>
-      <w:r>
-        <w:rPr>
-          <w:lang w:val="es-MX"/>
-        </w:rPr>
-        <w:t>front</w:t>
-      </w:r>
-      <w:proofErr w:type="spellEnd"/>
-      <w:r>
-        <w:rPr>
-          <w:lang w:val="es-MX"/>
-        </w:rPr>
-        <w:t xml:space="preserve"> </w:t>
-      </w:r>
-      <w:proofErr w:type="spellStart"/>
-      <w:r>
-        <w:rPr>
-          <w:lang w:val="es-MX"/>
-        </w:rPr>
-        <w:t>end</w:t>
-      </w:r>
-      <w:proofErr w:type="spellEnd"/>
-      <w:r>
-        <w:rPr>
-          <w:lang w:val="es-MX"/>
-        </w:rPr>
-        <w:t xml:space="preserve"> aporte con</w:t>
-      </w:r>
-      <w:r>
-        <w:rPr>
-          <w:lang w:val="es-MX"/>
-        </w:rPr>
-        <w:t xml:space="preserve"> el cambio en el </w:t>
-      </w:r>
-      <w:proofErr w:type="spellStart"/>
-      <w:r>
-        <w:rPr>
-          <w:lang w:val="es-MX"/>
-        </w:rPr>
-        <w:t>css</w:t>
-      </w:r>
-      <w:proofErr w:type="spellEnd"/>
+        <w:t>Dentro del front end aporte con</w:t>
+      </w:r>
+      <w:r>
+        <w:rPr>
+          <w:lang w:val="es-MX"/>
+        </w:rPr>
+        <w:t xml:space="preserve"> el cambio en el css</w:t>
+      </w:r>
     </w:p>
     <w:p>
       <w:pPr>
@@ -6743,35 +5801,7 @@
           <w:lang w:val="es-MX"/>
         </w:rPr>
         <w:lastRenderedPageBreak/>
-        <w:t xml:space="preserve">Este permite que el botón para filtrar los datos de las distintas tablas solo aparezca cuando hayas iniciado sesión en el </w:t>
-      </w:r>
-      <w:proofErr w:type="spellStart"/>
-      <w:r>
-        <w:rPr>
-          <w:lang w:val="es-MX"/>
-        </w:rPr>
-        <w:t>header</w:t>
-      </w:r>
-      <w:proofErr w:type="spellEnd"/>
-      <w:r>
-        <w:rPr>
-          <w:lang w:val="es-MX"/>
-        </w:rPr>
-        <w:t xml:space="preserve">, </w:t>
-      </w:r>
-      <w:proofErr w:type="spellStart"/>
-      <w:r>
-        <w:rPr>
-          <w:lang w:val="es-MX"/>
-        </w:rPr>
-        <w:t>ocultandolo</w:t>
-      </w:r>
-      <w:proofErr w:type="spellEnd"/>
-      <w:r>
-        <w:rPr>
-          <w:lang w:val="es-MX"/>
-        </w:rPr>
-        <w:t xml:space="preserve"> en la pantalla de inicio, así mismo esta conectado a las distintas rutas de cada una de las tablas dentro de la base de datos, así mismo me encargue de dar los primeros pasos en la conexión con esta ultima</w:t>
+        <w:t>Este permite que el botón para filtrar los datos de las distintas tablas solo aparezca cuando hayas iniciado sesión en el header, ocultandolo en la pantalla de inicio, así mismo esta conectado a las distintas rutas de cada una de las tablas dentro de la base de datos, así mismo me encargue de dar los primeros pasos en la conexión con esta ultima</w:t>
       </w:r>
     </w:p>
     <w:p>
@@ -6853,19 +5883,8 @@
           <w:szCs w:val="24"/>
           <w:lang w:val="es-MX"/>
         </w:rPr>
-        <w:t xml:space="preserve">Conexión con </w:t>
-      </w:r>
-      <w:proofErr w:type="spellStart"/>
-      <w:r>
-        <w:rPr>
-          <w:b/>
-          <w:sz w:val="24"/>
-          <w:szCs w:val="24"/>
-          <w:lang w:val="es-MX"/>
-        </w:rPr>
-        <w:t>db</w:t>
-      </w:r>
-      <w:proofErr w:type="spellEnd"/>
+        <w:t>Conexión con db</w:t>
+      </w:r>
     </w:p>
     <w:p>
       <w:pPr>
@@ -6951,37 +5970,20 @@
           <w:szCs w:val="24"/>
           <w:lang w:val="es-MX"/>
         </w:rPr>
-        <w:t xml:space="preserve">Dentro del progreso del proyecto, fui el encargado de levantar el servidor y conectarlo con la </w:t>
-      </w:r>
-      <w:proofErr w:type="spellStart"/>
-      <w:r>
-        <w:rPr>
-          <w:sz w:val="24"/>
-          <w:szCs w:val="24"/>
-          <w:lang w:val="es-MX"/>
-        </w:rPr>
-        <w:t>db</w:t>
-      </w:r>
-      <w:proofErr w:type="spellEnd"/>
-      <w:r>
-        <w:rPr>
-          <w:sz w:val="24"/>
-          <w:szCs w:val="24"/>
-          <w:lang w:val="es-MX"/>
-        </w:rPr>
-        <w:t xml:space="preserve"> y el proyecto, así mismo de vincularlo con el subdominio asignado por nuestros docentes</w:t>
-      </w:r>
-    </w:p>
-    <w:p>
-      <w:pPr>
-        <w:rPr>
-          <w:sz w:val="24"/>
-          <w:szCs w:val="24"/>
-          <w:lang w:val="es-MX"/>
-        </w:rPr>
-      </w:pPr>
-      <w:r>
-        <w:rPr>
+        <w:t>Dentro del progreso del proyecto, fui el encargado de levantar el servidor y conectarlo con la db y el proyecto, así mismo de vincularlo con el subdominio asignado por nuestros docentes</w:t>
+      </w:r>
+    </w:p>
+    <w:p>
+      <w:pPr>
+        <w:rPr>
+          <w:sz w:val="24"/>
+          <w:szCs w:val="24"/>
+          <w:lang w:val="es-MX"/>
+        </w:rPr>
+      </w:pPr>
+      <w:r>
+        <w:rPr>
+          <w:noProof/>
           <w:sz w:val="24"/>
           <w:szCs w:val="24"/>
           <w:lang w:val="es-MX"/>
@@ -7033,6 +6035,7 @@
       </w:pPr>
       <w:r>
         <w:rPr>
+          <w:noProof/>
           <w:sz w:val="24"/>
           <w:szCs w:val="24"/>
           <w:lang w:val="es-MX"/>
@@ -7084,6 +6087,7 @@
       </w:pPr>
       <w:r>
         <w:rPr>
+          <w:noProof/>
           <w:sz w:val="24"/>
           <w:szCs w:val="24"/>
           <w:lang w:val="es-MX"/>
@@ -7142,59 +6146,13 @@
           <w:lang w:val="es-MX"/>
         </w:rPr>
       </w:pPr>
-      <w:proofErr w:type="spellStart"/>
-      <w:r>
-        <w:rPr>
-          <w:sz w:val="24"/>
-          <w:szCs w:val="24"/>
-          <w:lang w:val="es-MX"/>
-        </w:rPr>
-        <w:t>Asi</w:t>
-      </w:r>
-      <w:proofErr w:type="spellEnd"/>
-      <w:r>
-        <w:rPr>
-          <w:sz w:val="24"/>
-          <w:szCs w:val="24"/>
-          <w:lang w:val="es-MX"/>
-        </w:rPr>
-        <w:t xml:space="preserve"> mismo se agrego un nuevo caso de uso que describe la </w:t>
-      </w:r>
-      <w:proofErr w:type="spellStart"/>
-      <w:r>
-        <w:rPr>
-          <w:sz w:val="24"/>
-          <w:szCs w:val="24"/>
-          <w:lang w:val="es-MX"/>
-        </w:rPr>
-        <w:t>reazignacion</w:t>
-      </w:r>
-      <w:proofErr w:type="spellEnd"/>
-      <w:r>
-        <w:rPr>
-          <w:sz w:val="24"/>
-          <w:szCs w:val="24"/>
-          <w:lang w:val="es-MX"/>
-        </w:rPr>
-        <w:t xml:space="preserve"> entre el cliente-vendedor por parte del </w:t>
-      </w:r>
-      <w:proofErr w:type="spellStart"/>
-      <w:r>
-        <w:rPr>
-          <w:sz w:val="24"/>
-          <w:szCs w:val="24"/>
-          <w:lang w:val="es-MX"/>
-        </w:rPr>
-        <w:t>admin</w:t>
-      </w:r>
-      <w:proofErr w:type="spellEnd"/>
-      <w:r>
-        <w:rPr>
-          <w:sz w:val="24"/>
-          <w:szCs w:val="24"/>
-          <w:lang w:val="es-MX"/>
-        </w:rPr>
-        <w:t xml:space="preserve"> o encargado de alguna empresa</w:t>
+      <w:r>
+        <w:rPr>
+          <w:sz w:val="24"/>
+          <w:szCs w:val="24"/>
+          <w:lang w:val="es-MX"/>
+        </w:rPr>
+        <w:t>Asi mismo se agrego un nuevo caso de uso que describe la reazignacion entre el cliente-vendedor por parte del admin o encargado de alguna empresa</w:t>
       </w:r>
     </w:p>
     <w:p>
@@ -7298,7 +6256,6 @@
           <w:lang w:val="es-MX"/>
         </w:rPr>
       </w:pPr>
-      <w:proofErr w:type="spellStart"/>
       <w:r>
         <w:rPr>
           <w:b/>
@@ -7307,9 +6264,60 @@
           <w:szCs w:val="24"/>
           <w:lang w:val="es-MX"/>
         </w:rPr>
-        <w:t>Pre-condiciones</w:t>
-      </w:r>
-      <w:proofErr w:type="spellEnd"/>
+        <w:t>Pre-condiciones: </w:t>
+      </w:r>
+    </w:p>
+    <w:p>
+      <w:pPr>
+        <w:rPr>
+          <w:sz w:val="24"/>
+          <w:szCs w:val="24"/>
+          <w:lang w:val="es-MX"/>
+        </w:rPr>
+      </w:pPr>
+      <w:r>
+        <w:rPr>
+          <w:sz w:val="24"/>
+          <w:szCs w:val="24"/>
+          <w:lang w:val="es-MX"/>
+        </w:rPr>
+        <w:t>- El sistema debe estar en funcionamiento.  </w:t>
+      </w:r>
+    </w:p>
+    <w:p>
+      <w:pPr>
+        <w:rPr>
+          <w:sz w:val="24"/>
+          <w:szCs w:val="24"/>
+          <w:lang w:val="es-MX"/>
+        </w:rPr>
+      </w:pPr>
+      <w:r>
+        <w:rPr>
+          <w:sz w:val="24"/>
+          <w:szCs w:val="24"/>
+          <w:lang w:val="es-MX"/>
+        </w:rPr>
+        <w:t>- El módulo de registro (logging) debe estar activado.  </w:t>
+      </w:r>
+    </w:p>
+    <w:p>
+      <w:pPr>
+        <w:rPr>
+          <w:sz w:val="24"/>
+          <w:szCs w:val="24"/>
+          <w:lang w:val="es-MX"/>
+        </w:rPr>
+      </w:pPr>
+    </w:p>
+    <w:p>
+      <w:pPr>
+        <w:rPr>
+          <w:sz w:val="24"/>
+          <w:szCs w:val="24"/>
+          <w:lang w:val="es-MX"/>
+        </w:rPr>
+      </w:pPr>
       <w:r>
         <w:rPr>
           <w:b/>
@@ -7318,78 +6326,33 @@
           <w:szCs w:val="24"/>
           <w:lang w:val="es-MX"/>
         </w:rPr>
-        <w:t>: </w:t>
-      </w:r>
-    </w:p>
-    <w:p>
-      <w:pPr>
-        <w:rPr>
-          <w:sz w:val="24"/>
-          <w:szCs w:val="24"/>
-          <w:lang w:val="es-MX"/>
-        </w:rPr>
-      </w:pPr>
-      <w:r>
-        <w:rPr>
-          <w:sz w:val="24"/>
-          <w:szCs w:val="24"/>
-          <w:lang w:val="es-MX"/>
-        </w:rPr>
-        <w:t>- El sistema debe estar en funcionamiento.  </w:t>
-      </w:r>
-    </w:p>
-    <w:p>
-      <w:pPr>
-        <w:rPr>
-          <w:sz w:val="24"/>
-          <w:szCs w:val="24"/>
-          <w:lang w:val="es-MX"/>
-        </w:rPr>
-      </w:pPr>
-      <w:r>
-        <w:rPr>
-          <w:sz w:val="24"/>
-          <w:szCs w:val="24"/>
-          <w:lang w:val="es-MX"/>
-        </w:rPr>
-        <w:t>- El módulo de registro (</w:t>
-      </w:r>
-      <w:proofErr w:type="spellStart"/>
-      <w:r>
-        <w:rPr>
-          <w:sz w:val="24"/>
-          <w:szCs w:val="24"/>
-          <w:lang w:val="es-MX"/>
-        </w:rPr>
-        <w:t>logging</w:t>
-      </w:r>
-      <w:proofErr w:type="spellEnd"/>
-      <w:r>
-        <w:rPr>
-          <w:sz w:val="24"/>
-          <w:szCs w:val="24"/>
-          <w:lang w:val="es-MX"/>
-        </w:rPr>
-        <w:t>) debe estar activado.  </w:t>
-      </w:r>
-    </w:p>
-    <w:p>
-      <w:pPr>
-        <w:rPr>
-          <w:sz w:val="24"/>
-          <w:szCs w:val="24"/>
-          <w:lang w:val="es-MX"/>
-        </w:rPr>
-      </w:pPr>
-    </w:p>
-    <w:p>
-      <w:pPr>
-        <w:rPr>
-          <w:sz w:val="24"/>
-          <w:szCs w:val="24"/>
-          <w:lang w:val="es-MX"/>
-        </w:rPr>
-      </w:pPr>
+        <w:t>Flujo Principal:</w:t>
+      </w:r>
+      <w:r>
+        <w:rPr>
+          <w:sz w:val="24"/>
+          <w:szCs w:val="24"/>
+          <w:lang w:val="es-MX"/>
+        </w:rPr>
+        <w:t> </w:t>
+      </w:r>
+    </w:p>
+    <w:p>
+      <w:pPr>
+        <w:rPr>
+          <w:sz w:val="24"/>
+          <w:szCs w:val="24"/>
+          <w:lang w:val="es-MX"/>
+        </w:rPr>
+      </w:pPr>
+      <w:r>
+        <w:rPr>
+          <w:sz w:val="24"/>
+          <w:szCs w:val="24"/>
+          <w:lang w:val="es-MX"/>
+        </w:rPr>
+        <w:t xml:space="preserve">1. </w:t>
+      </w:r>
       <w:r>
         <w:rPr>
           <w:b/>
@@ -7398,32 +6361,68 @@
           <w:szCs w:val="24"/>
           <w:lang w:val="es-MX"/>
         </w:rPr>
-        <w:t>Flujo Principal:</w:t>
-      </w:r>
-      <w:r>
-        <w:rPr>
-          <w:sz w:val="24"/>
-          <w:szCs w:val="24"/>
-          <w:lang w:val="es-MX"/>
-        </w:rPr>
-        <w:t> </w:t>
-      </w:r>
-    </w:p>
-    <w:p>
-      <w:pPr>
-        <w:rPr>
-          <w:sz w:val="24"/>
-          <w:szCs w:val="24"/>
-          <w:lang w:val="es-MX"/>
-        </w:rPr>
-      </w:pPr>
-      <w:r>
-        <w:rPr>
-          <w:sz w:val="24"/>
-          <w:szCs w:val="24"/>
-          <w:lang w:val="es-MX"/>
-        </w:rPr>
-        <w:t xml:space="preserve">1. </w:t>
+        <w:t>Detección de acción registrable:</w:t>
+      </w:r>
+    </w:p>
+    <w:p>
+      <w:pPr>
+        <w:rPr>
+          <w:sz w:val="24"/>
+          <w:szCs w:val="24"/>
+          <w:lang w:val="es-MX"/>
+        </w:rPr>
+      </w:pPr>
+      <w:r>
+        <w:rPr>
+          <w:sz w:val="24"/>
+          <w:szCs w:val="24"/>
+          <w:lang w:val="es-MX"/>
+        </w:rPr>
+        <w:lastRenderedPageBreak/>
+        <w:t>   - Un usuario o el sistema ejecuta una acción (ej.: modificar datos, eliminar registros, iniciar sesión).  </w:t>
+      </w:r>
+    </w:p>
+    <w:p>
+      <w:pPr>
+        <w:rPr>
+          <w:sz w:val="24"/>
+          <w:szCs w:val="24"/>
+          <w:lang w:val="es-MX"/>
+        </w:rPr>
+      </w:pPr>
+      <w:r>
+        <w:rPr>
+          <w:sz w:val="24"/>
+          <w:szCs w:val="24"/>
+          <w:lang w:val="es-MX"/>
+        </w:rPr>
+        <w:t>   - El sistema identifica si la acción debe ser registrada (según reglas predefinidas).  </w:t>
+      </w:r>
+    </w:p>
+    <w:p>
+      <w:pPr>
+        <w:rPr>
+          <w:sz w:val="24"/>
+          <w:szCs w:val="24"/>
+          <w:lang w:val="es-MX"/>
+        </w:rPr>
+      </w:pPr>
+    </w:p>
+    <w:p>
+      <w:pPr>
+        <w:rPr>
+          <w:sz w:val="24"/>
+          <w:szCs w:val="24"/>
+          <w:lang w:val="es-MX"/>
+        </w:rPr>
+      </w:pPr>
+      <w:r>
+        <w:rPr>
+          <w:sz w:val="24"/>
+          <w:szCs w:val="24"/>
+          <w:lang w:val="es-MX"/>
+        </w:rPr>
+        <w:t xml:space="preserve">2. </w:t>
       </w:r>
       <w:r>
         <w:rPr>
@@ -7433,68 +6432,49 @@
           <w:szCs w:val="24"/>
           <w:lang w:val="es-MX"/>
         </w:rPr>
-        <w:t>Detección de acción registrable:</w:t>
-      </w:r>
-    </w:p>
-    <w:p>
-      <w:pPr>
-        <w:rPr>
-          <w:sz w:val="24"/>
-          <w:szCs w:val="24"/>
-          <w:lang w:val="es-MX"/>
-        </w:rPr>
-      </w:pPr>
-      <w:r>
-        <w:rPr>
-          <w:sz w:val="24"/>
-          <w:szCs w:val="24"/>
-          <w:lang w:val="es-MX"/>
-        </w:rPr>
-        <w:lastRenderedPageBreak/>
-        <w:t>   - Un usuario o el sistema ejecuta una acción (ej.: modificar datos, eliminar registros, iniciar sesión).  </w:t>
-      </w:r>
-    </w:p>
-    <w:p>
-      <w:pPr>
-        <w:rPr>
-          <w:sz w:val="24"/>
-          <w:szCs w:val="24"/>
-          <w:lang w:val="es-MX"/>
-        </w:rPr>
-      </w:pPr>
-      <w:r>
-        <w:rPr>
-          <w:sz w:val="24"/>
-          <w:szCs w:val="24"/>
-          <w:lang w:val="es-MX"/>
-        </w:rPr>
-        <w:t>   - El sistema identifica si la acción debe ser registrada (según reglas predefinidas).  </w:t>
-      </w:r>
-    </w:p>
-    <w:p>
-      <w:pPr>
-        <w:rPr>
-          <w:sz w:val="24"/>
-          <w:szCs w:val="24"/>
-          <w:lang w:val="es-MX"/>
-        </w:rPr>
-      </w:pPr>
-    </w:p>
-    <w:p>
-      <w:pPr>
-        <w:rPr>
-          <w:sz w:val="24"/>
-          <w:szCs w:val="24"/>
-          <w:lang w:val="es-MX"/>
-        </w:rPr>
-      </w:pPr>
-      <w:r>
-        <w:rPr>
-          <w:sz w:val="24"/>
-          <w:szCs w:val="24"/>
-          <w:lang w:val="es-MX"/>
-        </w:rPr>
-        <w:t xml:space="preserve">2. </w:t>
+        <w:t>Generación del registro:</w:t>
+      </w:r>
+      <w:r>
+        <w:rPr>
+          <w:sz w:val="24"/>
+          <w:szCs w:val="24"/>
+          <w:lang w:val="es-MX"/>
+        </w:rPr>
+        <w:t>  </w:t>
+      </w:r>
+    </w:p>
+    <w:p>
+      <w:pPr>
+        <w:rPr>
+          <w:sz w:val="24"/>
+          <w:szCs w:val="24"/>
+          <w:lang w:val="es-MX"/>
+        </w:rPr>
+      </w:pPr>
+      <w:r>
+        <w:rPr>
+          <w:sz w:val="24"/>
+          <w:szCs w:val="24"/>
+          <w:lang w:val="es-MX"/>
+        </w:rPr>
+        <w:t>   - El sistema captura:  </w:t>
+      </w:r>
+    </w:p>
+    <w:p>
+      <w:pPr>
+        <w:rPr>
+          <w:sz w:val="24"/>
+          <w:szCs w:val="24"/>
+          <w:lang w:val="es-MX"/>
+        </w:rPr>
+      </w:pPr>
+      <w:r>
+        <w:rPr>
+          <w:sz w:val="24"/>
+          <w:szCs w:val="24"/>
+          <w:lang w:val="es-MX"/>
+        </w:rPr>
+        <w:t xml:space="preserve">     a. </w:t>
       </w:r>
       <w:r>
         <w:rPr>
@@ -7504,49 +6484,92 @@
           <w:szCs w:val="24"/>
           <w:lang w:val="es-MX"/>
         </w:rPr>
-        <w:t>Generación del registro:</w:t>
-      </w:r>
-      <w:r>
-        <w:rPr>
-          <w:sz w:val="24"/>
-          <w:szCs w:val="24"/>
-          <w:lang w:val="es-MX"/>
-        </w:rPr>
-        <w:t>  </w:t>
-      </w:r>
-    </w:p>
-    <w:p>
-      <w:pPr>
-        <w:rPr>
-          <w:sz w:val="24"/>
-          <w:szCs w:val="24"/>
-          <w:lang w:val="es-MX"/>
-        </w:rPr>
-      </w:pPr>
-      <w:r>
-        <w:rPr>
-          <w:sz w:val="24"/>
-          <w:szCs w:val="24"/>
-          <w:lang w:val="es-MX"/>
-        </w:rPr>
-        <w:t>   - El sistema captura:  </w:t>
-      </w:r>
-    </w:p>
-    <w:p>
-      <w:pPr>
-        <w:rPr>
-          <w:sz w:val="24"/>
-          <w:szCs w:val="24"/>
-          <w:lang w:val="es-MX"/>
-        </w:rPr>
-      </w:pPr>
-      <w:r>
-        <w:rPr>
-          <w:sz w:val="24"/>
-          <w:szCs w:val="24"/>
-          <w:lang w:val="es-MX"/>
-        </w:rPr>
-        <w:t xml:space="preserve">     a. </w:t>
+        <w:t>Fecha y hora</w:t>
+      </w:r>
+      <w:r>
+        <w:rPr>
+          <w:sz w:val="24"/>
+          <w:szCs w:val="24"/>
+          <w:lang w:val="es-MX"/>
+        </w:rPr>
+        <w:t xml:space="preserve"> exacta de la acción.  </w:t>
+      </w:r>
+    </w:p>
+    <w:p>
+      <w:pPr>
+        <w:rPr>
+          <w:sz w:val="24"/>
+          <w:szCs w:val="24"/>
+          <w:lang w:val="es-MX"/>
+        </w:rPr>
+      </w:pPr>
+      <w:r>
+        <w:rPr>
+          <w:sz w:val="24"/>
+          <w:szCs w:val="24"/>
+          <w:lang w:val="es-MX"/>
+        </w:rPr>
+        <w:t>     b. ID o nombre del usuario que realizó la acción.  </w:t>
+      </w:r>
+    </w:p>
+    <w:p>
+      <w:pPr>
+        <w:rPr>
+          <w:sz w:val="24"/>
+          <w:szCs w:val="24"/>
+          <w:lang w:val="es-MX"/>
+        </w:rPr>
+      </w:pPr>
+      <w:r>
+        <w:rPr>
+          <w:sz w:val="24"/>
+          <w:szCs w:val="24"/>
+          <w:lang w:val="es-MX"/>
+        </w:rPr>
+        <w:t>     c. Tipo de acción (ej.: "Actualización de perfil", "Eliminación de archivo").  </w:t>
+      </w:r>
+    </w:p>
+    <w:p>
+      <w:pPr>
+        <w:rPr>
+          <w:sz w:val="24"/>
+          <w:szCs w:val="24"/>
+          <w:lang w:val="es-MX"/>
+        </w:rPr>
+      </w:pPr>
+      <w:r>
+        <w:rPr>
+          <w:sz w:val="24"/>
+          <w:szCs w:val="24"/>
+          <w:lang w:val="es-MX"/>
+        </w:rPr>
+        <w:t>     d. Detalles relevantes (ej.: campo modificado, IP de acceso).  </w:t>
+      </w:r>
+    </w:p>
+    <w:p>
+      <w:pPr>
+        <w:rPr>
+          <w:sz w:val="24"/>
+          <w:szCs w:val="24"/>
+          <w:lang w:val="es-MX"/>
+        </w:rPr>
+      </w:pPr>
+    </w:p>
+    <w:p>
+      <w:pPr>
+        <w:rPr>
+          <w:sz w:val="24"/>
+          <w:szCs w:val="24"/>
+          <w:lang w:val="es-MX"/>
+        </w:rPr>
+      </w:pPr>
+      <w:r>
+        <w:rPr>
+          <w:sz w:val="24"/>
+          <w:szCs w:val="24"/>
+          <w:lang w:val="es-MX"/>
+        </w:rPr>
+        <w:t xml:space="preserve">3. </w:t>
       </w:r>
       <w:r>
         <w:rPr>
@@ -7556,93 +6579,51 @@
           <w:szCs w:val="24"/>
           <w:lang w:val="es-MX"/>
         </w:rPr>
-        <w:t>Fecha y hora</w:t>
-      </w:r>
-      <w:r>
-        <w:rPr>
-          <w:sz w:val="24"/>
-          <w:szCs w:val="24"/>
-          <w:lang w:val="es-MX"/>
-        </w:rPr>
-        <w:t xml:space="preserve"> exacta de la acción.  </w:t>
-      </w:r>
-    </w:p>
-    <w:p>
-      <w:pPr>
-        <w:rPr>
-          <w:sz w:val="24"/>
-          <w:szCs w:val="24"/>
-          <w:lang w:val="es-MX"/>
-        </w:rPr>
-      </w:pPr>
-      <w:r>
-        <w:rPr>
-          <w:sz w:val="24"/>
-          <w:szCs w:val="24"/>
-          <w:lang w:val="es-MX"/>
-        </w:rPr>
-        <w:t>     b. ID o nombre del usuario que realizó la acción.  </w:t>
-      </w:r>
-    </w:p>
-    <w:p>
-      <w:pPr>
-        <w:rPr>
-          <w:sz w:val="24"/>
-          <w:szCs w:val="24"/>
-          <w:lang w:val="es-MX"/>
-        </w:rPr>
-      </w:pPr>
-      <w:r>
-        <w:rPr>
-          <w:sz w:val="24"/>
-          <w:szCs w:val="24"/>
-          <w:lang w:val="es-MX"/>
-        </w:rPr>
-        <w:t>     c. Tipo de acción (ej.: "Actualización de perfil", "Eliminación de archivo").  </w:t>
-      </w:r>
-    </w:p>
-    <w:p>
-      <w:pPr>
-        <w:rPr>
-          <w:sz w:val="24"/>
-          <w:szCs w:val="24"/>
-          <w:lang w:val="es-MX"/>
-        </w:rPr>
-      </w:pPr>
-      <w:r>
-        <w:rPr>
-          <w:sz w:val="24"/>
-          <w:szCs w:val="24"/>
-          <w:lang w:val="es-MX"/>
-        </w:rPr>
-        <w:t>     d. Detalles relevantes (ej.: campo modificado, IP de acceso).  </w:t>
-      </w:r>
-    </w:p>
-    <w:p>
-      <w:pPr>
-        <w:rPr>
-          <w:sz w:val="24"/>
-          <w:szCs w:val="24"/>
-          <w:lang w:val="es-MX"/>
-        </w:rPr>
-      </w:pPr>
-    </w:p>
-    <w:p>
-      <w:pPr>
-        <w:rPr>
-          <w:sz w:val="24"/>
-          <w:szCs w:val="24"/>
-          <w:lang w:val="es-MX"/>
-        </w:rPr>
-      </w:pPr>
-      <w:r>
-        <w:rPr>
-          <w:sz w:val="24"/>
-          <w:szCs w:val="24"/>
-          <w:lang w:val="es-MX"/>
-        </w:rPr>
-        <w:t xml:space="preserve">3. </w:t>
-      </w:r>
+        <w:t>Almacenamiento seguro:</w:t>
+      </w:r>
+      <w:r>
+        <w:rPr>
+          <w:sz w:val="24"/>
+          <w:szCs w:val="24"/>
+          <w:lang w:val="es-MX"/>
+        </w:rPr>
+        <w:t> </w:t>
+      </w:r>
+    </w:p>
+    <w:p>
+      <w:pPr>
+        <w:rPr>
+          <w:sz w:val="24"/>
+          <w:szCs w:val="24"/>
+          <w:lang w:val="es-MX"/>
+        </w:rPr>
+      </w:pPr>
+      <w:r>
+        <w:rPr>
+          <w:sz w:val="24"/>
+          <w:szCs w:val="24"/>
+          <w:lang w:val="es-MX"/>
+        </w:rPr>
+        <w:t>   - El sistema guarda el registro en una base de datos o archivo de logs con acceso restringido.  </w:t>
+      </w:r>
+    </w:p>
+    <w:p>
+      <w:pPr>
+        <w:rPr>
+          <w:sz w:val="24"/>
+          <w:szCs w:val="24"/>
+          <w:lang w:val="es-MX"/>
+        </w:rPr>
+      </w:pPr>
+    </w:p>
+    <w:p>
+      <w:pPr>
+        <w:rPr>
+          <w:sz w:val="24"/>
+          <w:szCs w:val="24"/>
+          <w:lang w:val="es-MX"/>
+        </w:rPr>
+      </w:pPr>
       <w:r>
         <w:rPr>
           <w:b/>
@@ -7651,51 +6632,33 @@
           <w:szCs w:val="24"/>
           <w:lang w:val="es-MX"/>
         </w:rPr>
-        <w:t>Almacenamiento seguro:</w:t>
-      </w:r>
-      <w:r>
-        <w:rPr>
-          <w:sz w:val="24"/>
-          <w:szCs w:val="24"/>
-          <w:lang w:val="es-MX"/>
-        </w:rPr>
-        <w:t> </w:t>
-      </w:r>
-    </w:p>
-    <w:p>
-      <w:pPr>
-        <w:rPr>
-          <w:sz w:val="24"/>
-          <w:szCs w:val="24"/>
-          <w:lang w:val="es-MX"/>
-        </w:rPr>
-      </w:pPr>
-      <w:r>
-        <w:rPr>
-          <w:sz w:val="24"/>
-          <w:szCs w:val="24"/>
-          <w:lang w:val="es-MX"/>
-        </w:rPr>
-        <w:t>   - El sistema guarda el registro en una base de datos o archivo de logs con acceso restringido.  </w:t>
-      </w:r>
-    </w:p>
-    <w:p>
-      <w:pPr>
-        <w:rPr>
-          <w:sz w:val="24"/>
-          <w:szCs w:val="24"/>
-          <w:lang w:val="es-MX"/>
-        </w:rPr>
-      </w:pPr>
-    </w:p>
-    <w:p>
-      <w:pPr>
-        <w:rPr>
-          <w:sz w:val="24"/>
-          <w:szCs w:val="24"/>
-          <w:lang w:val="es-MX"/>
-        </w:rPr>
-      </w:pPr>
+        <w:t>Flujos Alternativos:</w:t>
+      </w:r>
+      <w:r>
+        <w:rPr>
+          <w:sz w:val="24"/>
+          <w:szCs w:val="24"/>
+          <w:lang w:val="es-MX"/>
+        </w:rPr>
+        <w:t>  </w:t>
+      </w:r>
+    </w:p>
+    <w:p>
+      <w:pPr>
+        <w:rPr>
+          <w:sz w:val="24"/>
+          <w:szCs w:val="24"/>
+          <w:lang w:val="es-MX"/>
+        </w:rPr>
+      </w:pPr>
+      <w:r>
+        <w:rPr>
+          <w:sz w:val="24"/>
+          <w:szCs w:val="24"/>
+          <w:lang w:val="es-MX"/>
+        </w:rPr>
+        <w:t xml:space="preserve">- </w:t>
+      </w:r>
       <w:r>
         <w:rPr>
           <w:b/>
@@ -7704,8 +6667,25 @@
           <w:szCs w:val="24"/>
           <w:lang w:val="es-MX"/>
         </w:rPr>
-        <w:t>Flujos Alternativos:</w:t>
-      </w:r>
+        <w:t>Acción fallida:</w:t>
+      </w:r>
+      <w:r>
+        <w:rPr>
+          <w:sz w:val="24"/>
+          <w:szCs w:val="24"/>
+          <w:lang w:val="es-MX"/>
+        </w:rPr>
+        <w:t> </w:t>
+      </w:r>
+    </w:p>
+    <w:p>
+      <w:pPr>
+        <w:rPr>
+          <w:sz w:val="24"/>
+          <w:szCs w:val="24"/>
+          <w:lang w:val="es-MX"/>
+        </w:rPr>
+      </w:pPr>
       <w:r>
         <w:rPr>
           <w:sz w:val="24"/>
@@ -7714,6 +6694,32 @@
         </w:rPr>
         <w:t>  </w:t>
       </w:r>
+      <w:r>
+        <w:rPr>
+          <w:sz w:val="24"/>
+          <w:szCs w:val="24"/>
+          <w:lang w:val="es-MX"/>
+        </w:rPr>
+        <w:tab/>
+      </w:r>
+      <w:r>
+        <w:rPr>
+          <w:sz w:val="24"/>
+          <w:szCs w:val="24"/>
+          <w:lang w:val="es-MX"/>
+        </w:rPr>
+        <w:tab/>
+        <w:t>a. Si una acción no se completa (ej.: error al eliminar un archivo), el sistema registra el intento y el motivo del fallo.  </w:t>
+      </w:r>
+    </w:p>
+    <w:p>
+      <w:pPr>
+        <w:rPr>
+          <w:sz w:val="24"/>
+          <w:szCs w:val="24"/>
+          <w:lang w:val="es-MX"/>
+        </w:rPr>
+      </w:pPr>
     </w:p>
     <w:p>
       <w:pPr>
@@ -7739,8 +6745,25 @@
           <w:szCs w:val="24"/>
           <w:lang w:val="es-MX"/>
         </w:rPr>
-        <w:t>Acción fallida:</w:t>
-      </w:r>
+        <w:t>Exportación de logs (Administrador):</w:t>
+      </w:r>
+      <w:r>
+        <w:rPr>
+          <w:sz w:val="24"/>
+          <w:szCs w:val="24"/>
+          <w:lang w:val="es-MX"/>
+        </w:rPr>
+        <w:t>  </w:t>
+      </w:r>
+    </w:p>
+    <w:p>
+      <w:pPr>
+        <w:rPr>
+          <w:sz w:val="24"/>
+          <w:szCs w:val="24"/>
+          <w:lang w:val="es-MX"/>
+        </w:rPr>
+      </w:pPr>
       <w:r>
         <w:rPr>
           <w:sz w:val="24"/>
@@ -7749,6 +6772,15 @@
         </w:rPr>
         <w:t> </w:t>
       </w:r>
+      <w:r>
+        <w:rPr>
+          <w:sz w:val="24"/>
+          <w:szCs w:val="24"/>
+          <w:lang w:val="es-MX"/>
+        </w:rPr>
+        <w:tab/>
+        <w:t xml:space="preserve"> a. El administrador solicita exportar los registros en un formato específico (CSV, PDF).  </w:t>
+      </w:r>
     </w:p>
     <w:p>
       <w:pPr>
@@ -7773,42 +6805,26 @@
           <w:lang w:val="es-MX"/>
         </w:rPr>
         <w:tab/>
-      </w:r>
-      <w:r>
-        <w:rPr>
-          <w:sz w:val="24"/>
-          <w:szCs w:val="24"/>
-          <w:lang w:val="es-MX"/>
-        </w:rPr>
-        <w:tab/>
-        <w:t>a. Si una acción no se completa (ej.: error al eliminar un archivo), el sistema registra el intento y el motivo del fallo.  </w:t>
-      </w:r>
-    </w:p>
-    <w:p>
-      <w:pPr>
-        <w:rPr>
-          <w:sz w:val="24"/>
-          <w:szCs w:val="24"/>
-          <w:lang w:val="es-MX"/>
-        </w:rPr>
-      </w:pPr>
-    </w:p>
-    <w:p>
-      <w:pPr>
-        <w:rPr>
-          <w:sz w:val="24"/>
-          <w:szCs w:val="24"/>
-          <w:lang w:val="es-MX"/>
-        </w:rPr>
-      </w:pPr>
-      <w:r>
-        <w:rPr>
-          <w:sz w:val="24"/>
-          <w:szCs w:val="24"/>
-          <w:lang w:val="es-MX"/>
-        </w:rPr>
-        <w:t xml:space="preserve">- </w:t>
-      </w:r>
+        <w:t>b. El sistema genera el archivo y lo descarga de manera segura.  </w:t>
+      </w:r>
+    </w:p>
+    <w:p>
+      <w:pPr>
+        <w:rPr>
+          <w:sz w:val="24"/>
+          <w:szCs w:val="24"/>
+          <w:lang w:val="es-MX"/>
+        </w:rPr>
+      </w:pPr>
+    </w:p>
+    <w:p>
+      <w:pPr>
+        <w:rPr>
+          <w:sz w:val="24"/>
+          <w:szCs w:val="24"/>
+          <w:lang w:val="es-MX"/>
+        </w:rPr>
+      </w:pPr>
       <w:r>
         <w:rPr>
           <w:b/>
@@ -7817,7 +6833,7 @@
           <w:szCs w:val="24"/>
           <w:lang w:val="es-MX"/>
         </w:rPr>
-        <w:t>Exportación de logs (Administrador):</w:t>
+        <w:t>Post-condiciones:</w:t>
       </w:r>
       <w:r>
         <w:rPr>
@@ -7842,155 +6858,90 @@
           <w:szCs w:val="24"/>
           <w:lang w:val="es-MX"/>
         </w:rPr>
-        <w:t> </w:t>
-      </w:r>
-      <w:r>
-        <w:rPr>
-          <w:sz w:val="24"/>
-          <w:szCs w:val="24"/>
-          <w:lang w:val="es-MX"/>
-        </w:rPr>
-        <w:tab/>
-        <w:t xml:space="preserve"> a. El administrador solicita exportar los registros en un formato específico (CSV, PDF).  </w:t>
-      </w:r>
-    </w:p>
-    <w:p>
-      <w:pPr>
-        <w:rPr>
-          <w:sz w:val="24"/>
-          <w:szCs w:val="24"/>
-          <w:lang w:val="es-MX"/>
-        </w:rPr>
-      </w:pPr>
-      <w:r>
-        <w:rPr>
-          <w:sz w:val="24"/>
-          <w:szCs w:val="24"/>
-          <w:lang w:val="es-MX"/>
-        </w:rPr>
-        <w:t>  </w:t>
-      </w:r>
-      <w:r>
-        <w:rPr>
-          <w:sz w:val="24"/>
-          <w:szCs w:val="24"/>
-          <w:lang w:val="es-MX"/>
-        </w:rPr>
-        <w:tab/>
-        <w:t>b. El sistema genera el archivo y lo descarga de manera segura.  </w:t>
-      </w:r>
-    </w:p>
-    <w:p>
-      <w:pPr>
-        <w:rPr>
-          <w:sz w:val="24"/>
-          <w:szCs w:val="24"/>
-          <w:lang w:val="es-MX"/>
-        </w:rPr>
-      </w:pPr>
-    </w:p>
-    <w:p>
-      <w:pPr>
-        <w:rPr>
-          <w:sz w:val="24"/>
-          <w:szCs w:val="24"/>
-          <w:lang w:val="es-MX"/>
-        </w:rPr>
-      </w:pPr>
-      <w:proofErr w:type="spellStart"/>
-      <w:proofErr w:type="gramStart"/>
-      <w:r>
+        <w:t>- El registro queda almacenado de manera inmutable (sin modificaciones posteriores).  </w:t>
+      </w:r>
+    </w:p>
+    <w:p>
+      <w:pPr>
+        <w:rPr>
+          <w:sz w:val="24"/>
+          <w:szCs w:val="24"/>
+          <w:lang w:val="es-MX"/>
+        </w:rPr>
+      </w:pPr>
+      <w:r>
+        <w:rPr>
+          <w:sz w:val="24"/>
+          <w:szCs w:val="24"/>
+          <w:lang w:val="es-MX"/>
+        </w:rPr>
+        <w:t>- El administrador puede consultar los registros cuando lo requiera.  </w:t>
+      </w:r>
+    </w:p>
+    <w:p>
+      <w:pPr>
+        <w:rPr>
+          <w:sz w:val="24"/>
+          <w:szCs w:val="24"/>
+          <w:lang w:val="es-MX"/>
+        </w:rPr>
+      </w:pPr>
+      <w:r>
+        <w:rPr>
+          <w:sz w:val="24"/>
+          <w:szCs w:val="24"/>
+          <w:lang w:val="es-MX"/>
+        </w:rPr>
+        <w:br/>
+      </w:r>
+      <w:r>
+        <w:rPr>
+          <w:sz w:val="24"/>
+          <w:szCs w:val="24"/>
+          <w:lang w:val="es-MX"/>
+        </w:rPr>
+        <w:br/>
+      </w:r>
+    </w:p>
+    <w:p>
+      <w:pPr>
         <w:rPr>
           <w:b/>
           <w:bCs/>
           <w:sz w:val="24"/>
           <w:szCs w:val="24"/>
-          <w:lang w:val="es-MX"/>
-        </w:rPr>
-        <w:t>Post-condiciones</w:t>
-      </w:r>
-      <w:proofErr w:type="spellEnd"/>
-      <w:proofErr w:type="gramEnd"/>
+          <w:lang w:val="en-US"/>
+        </w:rPr>
+      </w:pPr>
       <w:r>
         <w:rPr>
           <w:b/>
           <w:bCs/>
           <w:sz w:val="24"/>
           <w:szCs w:val="24"/>
-          <w:lang w:val="es-MX"/>
-        </w:rPr>
-        <w:t>:</w:t>
-      </w:r>
-      <w:r>
-        <w:rPr>
-          <w:sz w:val="24"/>
-          <w:szCs w:val="24"/>
-          <w:lang w:val="es-MX"/>
-        </w:rPr>
-        <w:t>  </w:t>
-      </w:r>
-    </w:p>
-    <w:p>
-      <w:pPr>
-        <w:rPr>
-          <w:sz w:val="24"/>
-          <w:szCs w:val="24"/>
-          <w:lang w:val="es-MX"/>
-        </w:rPr>
-      </w:pPr>
-      <w:r>
-        <w:rPr>
-          <w:sz w:val="24"/>
-          <w:szCs w:val="24"/>
-          <w:lang w:val="es-MX"/>
-        </w:rPr>
-        <w:t>- El registro queda almacenado de manera inmutable (sin modificaciones posteriores).  </w:t>
-      </w:r>
-    </w:p>
-    <w:p>
-      <w:pPr>
-        <w:rPr>
-          <w:sz w:val="24"/>
-          <w:szCs w:val="24"/>
-          <w:lang w:val="es-MX"/>
-        </w:rPr>
-      </w:pPr>
-      <w:r>
-        <w:rPr>
-          <w:sz w:val="24"/>
-          <w:szCs w:val="24"/>
-          <w:lang w:val="es-MX"/>
-        </w:rPr>
-        <w:t>- El administrador puede consultar los registros cuando lo requiera.  </w:t>
-      </w:r>
-    </w:p>
-    <w:p>
-      <w:pPr>
-        <w:rPr>
-          <w:sz w:val="24"/>
-          <w:szCs w:val="24"/>
-          <w:lang w:val="es-MX"/>
-        </w:rPr>
-      </w:pPr>
-      <w:r>
-        <w:rPr>
-          <w:sz w:val="24"/>
-          <w:szCs w:val="24"/>
-          <w:lang w:val="es-MX"/>
-        </w:rPr>
-        <w:br/>
-      </w:r>
-      <w:r>
-        <w:rPr>
-          <w:sz w:val="24"/>
-          <w:szCs w:val="24"/>
-          <w:lang w:val="es-MX"/>
-        </w:rPr>
-        <w:br/>
-      </w:r>
-    </w:p>
-    <w:p>
-      <w:pPr>
+          <w:lang w:val="en-US"/>
+        </w:rPr>
+        <w:t>CP10 - Registro de actividades</w:t>
+      </w:r>
+    </w:p>
+    <w:p>
+      <w:pPr>
+        <w:rPr>
+          <w:sz w:val="24"/>
+          <w:szCs w:val="24"/>
+          <w:lang w:val="en-US"/>
+        </w:rPr>
+      </w:pPr>
+    </w:p>
+    <w:p>
+      <w:pPr>
+        <w:rPr>
+          <w:sz w:val="24"/>
+          <w:szCs w:val="24"/>
+          <w:lang w:val="en-US"/>
+        </w:rPr>
+      </w:pPr>
+      <w:r>
         <w:rPr>
           <w:b/>
           <w:bCs/>
@@ -7998,81 +6949,8 @@
           <w:szCs w:val="24"/>
           <w:lang w:val="en-US"/>
         </w:rPr>
-      </w:pPr>
-      <w:r>
-        <w:rPr>
-          <w:b/>
-          <w:bCs/>
-          <w:sz w:val="24"/>
-          <w:szCs w:val="24"/>
-          <w:lang w:val="en-US"/>
-        </w:rPr>
-        <w:t xml:space="preserve">CP10 - </w:t>
-      </w:r>
-      <w:proofErr w:type="spellStart"/>
-      <w:r>
-        <w:rPr>
-          <w:b/>
-          <w:bCs/>
-          <w:sz w:val="24"/>
-          <w:szCs w:val="24"/>
-          <w:lang w:val="en-US"/>
-        </w:rPr>
-        <w:t>Registro</w:t>
-      </w:r>
-      <w:proofErr w:type="spellEnd"/>
-      <w:r>
-        <w:rPr>
-          <w:b/>
-          <w:bCs/>
-          <w:sz w:val="24"/>
-          <w:szCs w:val="24"/>
-          <w:lang w:val="en-US"/>
-        </w:rPr>
-        <w:t xml:space="preserve"> de </w:t>
-      </w:r>
-      <w:proofErr w:type="spellStart"/>
-      <w:r>
-        <w:rPr>
-          <w:b/>
-          <w:bCs/>
-          <w:sz w:val="24"/>
-          <w:szCs w:val="24"/>
-          <w:lang w:val="en-US"/>
-        </w:rPr>
-        <w:t>actividades</w:t>
-      </w:r>
-      <w:proofErr w:type="spellEnd"/>
-    </w:p>
-    <w:p>
-      <w:pPr>
-        <w:rPr>
-          <w:sz w:val="24"/>
-          <w:szCs w:val="24"/>
-          <w:lang w:val="en-US"/>
-        </w:rPr>
-      </w:pPr>
-    </w:p>
-    <w:p>
-      <w:pPr>
-        <w:rPr>
-          <w:sz w:val="24"/>
-          <w:szCs w:val="24"/>
-          <w:lang w:val="en-US"/>
-        </w:rPr>
-      </w:pPr>
-      <w:proofErr w:type="spellStart"/>
-      <w:r>
-        <w:rPr>
-          <w:b/>
-          <w:bCs/>
-          <w:sz w:val="24"/>
-          <w:szCs w:val="24"/>
-          <w:lang w:val="en-US"/>
-        </w:rPr>
         <w:t>Escenarios</w:t>
       </w:r>
-      <w:proofErr w:type="spellEnd"/>
     </w:p>
     <w:p>
       <w:pPr>
@@ -8125,7 +7003,6 @@
                 <w:lang w:val="en-US"/>
               </w:rPr>
             </w:pPr>
-            <w:proofErr w:type="spellStart"/>
             <w:r>
               <w:rPr>
                 <w:b/>
@@ -8136,7 +7013,6 @@
               </w:rPr>
               <w:t>Escenario</w:t>
             </w:r>
-            <w:proofErr w:type="spellEnd"/>
           </w:p>
         </w:tc>
         <w:tc>
@@ -8164,7 +7040,6 @@
                 <w:lang w:val="en-US"/>
               </w:rPr>
             </w:pPr>
-            <w:proofErr w:type="spellStart"/>
             <w:r>
               <w:rPr>
                 <w:b/>
@@ -8173,18 +7048,7 @@
                 <w:szCs w:val="24"/>
                 <w:lang w:val="en-US"/>
               </w:rPr>
-              <w:t>Flujo</w:t>
-            </w:r>
-            <w:proofErr w:type="spellEnd"/>
-            <w:r>
-              <w:rPr>
-                <w:b/>
-                <w:bCs/>
-                <w:sz w:val="24"/>
-                <w:szCs w:val="24"/>
-                <w:lang w:val="en-US"/>
-              </w:rPr>
-              <w:t xml:space="preserve"> Base</w:t>
+              <w:t>Flujo Base</w:t>
             </w:r>
           </w:p>
         </w:tc>
@@ -8213,7 +7077,6 @@
                 <w:lang w:val="en-US"/>
               </w:rPr>
             </w:pPr>
-            <w:proofErr w:type="spellStart"/>
             <w:r>
               <w:rPr>
                 <w:b/>
@@ -8222,18 +7085,7 @@
                 <w:szCs w:val="24"/>
                 <w:lang w:val="en-US"/>
               </w:rPr>
-              <w:t>Flujo</w:t>
-            </w:r>
-            <w:proofErr w:type="spellEnd"/>
-            <w:r>
-              <w:rPr>
-                <w:b/>
-                <w:bCs/>
-                <w:sz w:val="24"/>
-                <w:szCs w:val="24"/>
-                <w:lang w:val="en-US"/>
-              </w:rPr>
-              <w:t xml:space="preserve"> Alternativo</w:t>
+              <w:t>Flujo Alternativo</w:t>
             </w:r>
           </w:p>
         </w:tc>
@@ -8270,36 +7122,8 @@
                 <w:szCs w:val="24"/>
                 <w:lang w:val="en-US"/>
               </w:rPr>
-              <w:t xml:space="preserve">1 - </w:t>
-            </w:r>
-            <w:proofErr w:type="spellStart"/>
-            <w:r>
-              <w:rPr>
-                <w:sz w:val="24"/>
-                <w:szCs w:val="24"/>
-                <w:lang w:val="en-US"/>
-              </w:rPr>
-              <w:t>Registro</w:t>
-            </w:r>
-            <w:proofErr w:type="spellEnd"/>
-            <w:r>
-              <w:rPr>
-                <w:sz w:val="24"/>
-                <w:szCs w:val="24"/>
-                <w:lang w:val="en-US"/>
-              </w:rPr>
-              <w:t xml:space="preserve"> </w:t>
-            </w:r>
-            <w:proofErr w:type="spellStart"/>
-            <w:r>
-              <w:rPr>
-                <w:sz w:val="24"/>
-                <w:szCs w:val="24"/>
-                <w:lang w:val="en-US"/>
-              </w:rPr>
-              <w:t>exitoso</w:t>
-            </w:r>
-            <w:proofErr w:type="spellEnd"/>
+              <w:t>1 - Registro exitoso</w:t>
+            </w:r>
           </w:p>
         </w:tc>
         <w:tc>
@@ -8327,23 +7151,13 @@
                 <w:lang w:val="en-US"/>
               </w:rPr>
             </w:pPr>
-            <w:proofErr w:type="spellStart"/>
             <w:r>
               <w:rPr>
                 <w:sz w:val="24"/>
                 <w:szCs w:val="24"/>
                 <w:lang w:val="en-US"/>
               </w:rPr>
-              <w:t>Flujo</w:t>
-            </w:r>
-            <w:proofErr w:type="spellEnd"/>
-            <w:r>
-              <w:rPr>
-                <w:sz w:val="24"/>
-                <w:szCs w:val="24"/>
-                <w:lang w:val="en-US"/>
-              </w:rPr>
-              <w:t xml:space="preserve"> principal</w:t>
+              <w:t>Flujo principal</w:t>
             </w:r>
           </w:p>
         </w:tc>
@@ -8378,25 +7192,7 @@
                 <w:szCs w:val="24"/>
                 <w:lang w:val="es-MX"/>
               </w:rPr>
-              <w:t>Acción crítica registrada (</w:t>
-            </w:r>
-            <w:proofErr w:type="spellStart"/>
-            <w:r>
-              <w:rPr>
-                <w:sz w:val="24"/>
-                <w:szCs w:val="24"/>
-                <w:lang w:val="es-MX"/>
-              </w:rPr>
-              <w:t>ej</w:t>
-            </w:r>
-            <w:proofErr w:type="spellEnd"/>
-            <w:r>
-              <w:rPr>
-                <w:sz w:val="24"/>
-                <w:szCs w:val="24"/>
-                <w:lang w:val="es-MX"/>
-              </w:rPr>
-              <w:t>: eliminar archivo)</w:t>
+              <w:t>Acción crítica registrada (ej: eliminar archivo)</w:t>
             </w:r>
           </w:p>
         </w:tc>
@@ -8434,36 +7230,8 @@
                 <w:lang w:val="en-US"/>
               </w:rPr>
               <w:lastRenderedPageBreak/>
-              <w:t xml:space="preserve">2 - </w:t>
-            </w:r>
-            <w:proofErr w:type="spellStart"/>
-            <w:r>
-              <w:rPr>
-                <w:sz w:val="24"/>
-                <w:szCs w:val="24"/>
-                <w:lang w:val="en-US"/>
-              </w:rPr>
-              <w:t>Acción</w:t>
-            </w:r>
-            <w:proofErr w:type="spellEnd"/>
-            <w:r>
-              <w:rPr>
-                <w:sz w:val="24"/>
-                <w:szCs w:val="24"/>
-                <w:lang w:val="en-US"/>
-              </w:rPr>
-              <w:t xml:space="preserve"> </w:t>
-            </w:r>
-            <w:proofErr w:type="spellStart"/>
-            <w:r>
-              <w:rPr>
-                <w:sz w:val="24"/>
-                <w:szCs w:val="24"/>
-                <w:lang w:val="en-US"/>
-              </w:rPr>
-              <w:t>fallida</w:t>
-            </w:r>
-            <w:proofErr w:type="spellEnd"/>
+              <w:t>2 - Acción fallida</w:t>
+            </w:r>
           </w:p>
         </w:tc>
         <w:tc>
@@ -8491,23 +7259,13 @@
                 <w:lang w:val="en-US"/>
               </w:rPr>
             </w:pPr>
-            <w:proofErr w:type="spellStart"/>
             <w:r>
               <w:rPr>
                 <w:sz w:val="24"/>
                 <w:szCs w:val="24"/>
                 <w:lang w:val="en-US"/>
               </w:rPr>
-              <w:t>Flujo</w:t>
-            </w:r>
-            <w:proofErr w:type="spellEnd"/>
-            <w:r>
-              <w:rPr>
-                <w:sz w:val="24"/>
-                <w:szCs w:val="24"/>
-                <w:lang w:val="en-US"/>
-              </w:rPr>
-              <w:t xml:space="preserve"> alternativo</w:t>
+              <w:t>Flujo alternativo</w:t>
             </w:r>
           </w:p>
         </w:tc>
@@ -8579,25 +7337,7 @@
                 <w:szCs w:val="24"/>
                 <w:lang w:val="en-US"/>
               </w:rPr>
-              <w:t xml:space="preserve">3 - </w:t>
-            </w:r>
-            <w:proofErr w:type="spellStart"/>
-            <w:r>
-              <w:rPr>
-                <w:sz w:val="24"/>
-                <w:szCs w:val="24"/>
-                <w:lang w:val="en-US"/>
-              </w:rPr>
-              <w:t>Exportación</w:t>
-            </w:r>
-            <w:proofErr w:type="spellEnd"/>
-            <w:r>
-              <w:rPr>
-                <w:sz w:val="24"/>
-                <w:szCs w:val="24"/>
-                <w:lang w:val="en-US"/>
-              </w:rPr>
-              <w:t xml:space="preserve"> de logs</w:t>
+              <w:t>3 - Exportación de logs</w:t>
             </w:r>
           </w:p>
         </w:tc>
@@ -8626,23 +7366,13 @@
                 <w:lang w:val="en-US"/>
               </w:rPr>
             </w:pPr>
-            <w:proofErr w:type="spellStart"/>
             <w:r>
               <w:rPr>
                 <w:sz w:val="24"/>
                 <w:szCs w:val="24"/>
                 <w:lang w:val="en-US"/>
               </w:rPr>
-              <w:t>Flujo</w:t>
-            </w:r>
-            <w:proofErr w:type="spellEnd"/>
-            <w:r>
-              <w:rPr>
-                <w:sz w:val="24"/>
-                <w:szCs w:val="24"/>
-                <w:lang w:val="en-US"/>
-              </w:rPr>
-              <w:t xml:space="preserve"> alternativo</w:t>
+              <w:t>Flujo alternativo</w:t>
             </w:r>
           </w:p>
         </w:tc>
@@ -8714,36 +7444,8 @@
                 <w:szCs w:val="24"/>
                 <w:lang w:val="en-US"/>
               </w:rPr>
-              <w:t xml:space="preserve">4 - </w:t>
-            </w:r>
-            <w:proofErr w:type="spellStart"/>
-            <w:r>
-              <w:rPr>
-                <w:sz w:val="24"/>
-                <w:szCs w:val="24"/>
-                <w:lang w:val="en-US"/>
-              </w:rPr>
-              <w:t>Módulo</w:t>
-            </w:r>
-            <w:proofErr w:type="spellEnd"/>
-            <w:r>
-              <w:rPr>
-                <w:sz w:val="24"/>
-                <w:szCs w:val="24"/>
-                <w:lang w:val="en-US"/>
-              </w:rPr>
-              <w:t xml:space="preserve"> de logs </w:t>
-            </w:r>
-            <w:proofErr w:type="spellStart"/>
-            <w:r>
-              <w:rPr>
-                <w:sz w:val="24"/>
-                <w:szCs w:val="24"/>
-                <w:lang w:val="en-US"/>
-              </w:rPr>
-              <w:t>desactivado</w:t>
-            </w:r>
-            <w:proofErr w:type="spellEnd"/>
+              <w:t>4 - Módulo de logs desactivado</w:t>
+            </w:r>
           </w:p>
         </w:tc>
         <w:tc>
@@ -8806,34 +7508,14 @@
                 <w:lang w:val="en-US"/>
               </w:rPr>
             </w:pPr>
-            <w:proofErr w:type="spellStart"/>
             <w:r>
               <w:rPr>
                 <w:sz w:val="24"/>
                 <w:szCs w:val="24"/>
                 <w:lang w:val="en-US"/>
               </w:rPr>
-              <w:t>Acciones</w:t>
-            </w:r>
-            <w:proofErr w:type="spellEnd"/>
-            <w:r>
-              <w:rPr>
-                <w:sz w:val="24"/>
-                <w:szCs w:val="24"/>
-                <w:lang w:val="en-US"/>
-              </w:rPr>
-              <w:t xml:space="preserve"> no se </w:t>
-            </w:r>
-            <w:proofErr w:type="spellStart"/>
-            <w:r>
-              <w:rPr>
-                <w:sz w:val="24"/>
-                <w:szCs w:val="24"/>
-                <w:lang w:val="en-US"/>
-              </w:rPr>
-              <w:t>registran</w:t>
-            </w:r>
-            <w:proofErr w:type="spellEnd"/>
+              <w:t>Acciones no se registran</w:t>
+            </w:r>
           </w:p>
         </w:tc>
       </w:tr>
@@ -8863,20 +7545,8 @@
           <w:szCs w:val="24"/>
           <w:lang w:val="en-US"/>
         </w:rPr>
-        <w:t xml:space="preserve">Casos de </w:t>
-      </w:r>
-      <w:proofErr w:type="spellStart"/>
-      <w:r>
-        <w:rPr>
-          <w:b/>
-          <w:bCs/>
-          <w:sz w:val="24"/>
-          <w:szCs w:val="24"/>
-          <w:lang w:val="en-US"/>
-        </w:rPr>
-        <w:t>Prueba</w:t>
-      </w:r>
-      <w:proofErr w:type="spellEnd"/>
+        <w:t>Casos de Prueba</w:t>
+      </w:r>
     </w:p>
     <w:p>
       <w:pPr>
@@ -8969,7 +7639,6 @@
                 <w:lang w:val="en-US"/>
               </w:rPr>
             </w:pPr>
-            <w:proofErr w:type="spellStart"/>
             <w:r>
               <w:rPr>
                 <w:b/>
@@ -8980,7 +7649,6 @@
               </w:rPr>
               <w:t>Escenario</w:t>
             </w:r>
-            <w:proofErr w:type="spellEnd"/>
           </w:p>
         </w:tc>
         <w:tc>
@@ -9053,20 +7721,8 @@
                 <w:szCs w:val="24"/>
                 <w:lang w:val="en-US"/>
               </w:rPr>
-              <w:t xml:space="preserve">Logs </w:t>
-            </w:r>
-            <w:proofErr w:type="spellStart"/>
-            <w:r>
-              <w:rPr>
-                <w:b/>
-                <w:bCs/>
-                <w:sz w:val="24"/>
-                <w:szCs w:val="24"/>
-                <w:lang w:val="en-US"/>
-              </w:rPr>
-              <w:t>activos</w:t>
-            </w:r>
-            <w:proofErr w:type="spellEnd"/>
+              <w:t>Logs activos</w:t>
+            </w:r>
           </w:p>
         </w:tc>
         <w:tc>
@@ -9094,7 +7750,6 @@
                 <w:lang w:val="en-US"/>
               </w:rPr>
             </w:pPr>
-            <w:proofErr w:type="spellStart"/>
             <w:r>
               <w:rPr>
                 <w:b/>
@@ -9103,18 +7758,7 @@
                 <w:szCs w:val="24"/>
                 <w:lang w:val="en-US"/>
               </w:rPr>
-              <w:t>Permisos</w:t>
-            </w:r>
-            <w:proofErr w:type="spellEnd"/>
-            <w:r>
-              <w:rPr>
-                <w:b/>
-                <w:bCs/>
-                <w:sz w:val="24"/>
-                <w:szCs w:val="24"/>
-                <w:lang w:val="en-US"/>
-              </w:rPr>
-              <w:t xml:space="preserve"> admin</w:t>
+              <w:t>Permisos admin</w:t>
             </w:r>
           </w:p>
         </w:tc>
@@ -9143,7 +7787,6 @@
                 <w:lang w:val="en-US"/>
               </w:rPr>
             </w:pPr>
-            <w:proofErr w:type="spellStart"/>
             <w:r>
               <w:rPr>
                 <w:b/>
@@ -9152,31 +7795,8 @@
                 <w:szCs w:val="24"/>
                 <w:lang w:val="en-US"/>
               </w:rPr>
-              <w:t>Resultado</w:t>
-            </w:r>
-            <w:proofErr w:type="spellEnd"/>
-            <w:r>
-              <w:rPr>
-                <w:b/>
-                <w:bCs/>
-                <w:sz w:val="24"/>
-                <w:szCs w:val="24"/>
-                <w:lang w:val="en-US"/>
-              </w:rPr>
-              <w:t xml:space="preserve"> </w:t>
-            </w:r>
-            <w:proofErr w:type="spellStart"/>
-            <w:r>
-              <w:rPr>
-                <w:b/>
-                <w:bCs/>
-                <w:sz w:val="24"/>
-                <w:szCs w:val="24"/>
-                <w:lang w:val="en-US"/>
-              </w:rPr>
-              <w:t>Esperado</w:t>
-            </w:r>
-            <w:proofErr w:type="spellEnd"/>
+              <w:t>Resultado Esperado</w:t>
+            </w:r>
           </w:p>
         </w:tc>
       </w:tr>
@@ -9381,59 +8001,13 @@
                 <w:lang w:val="en-US"/>
               </w:rPr>
             </w:pPr>
-            <w:proofErr w:type="spellStart"/>
             <w:r>
               <w:rPr>
                 <w:sz w:val="24"/>
                 <w:szCs w:val="24"/>
                 <w:lang w:val="en-US"/>
               </w:rPr>
-              <w:t>Acción</w:t>
-            </w:r>
-            <w:proofErr w:type="spellEnd"/>
-            <w:r>
-              <w:rPr>
-                <w:sz w:val="24"/>
-                <w:szCs w:val="24"/>
-                <w:lang w:val="en-US"/>
-              </w:rPr>
-              <w:t xml:space="preserve"> </w:t>
-            </w:r>
-            <w:proofErr w:type="spellStart"/>
-            <w:r>
-              <w:rPr>
-                <w:sz w:val="24"/>
-                <w:szCs w:val="24"/>
-                <w:lang w:val="en-US"/>
-              </w:rPr>
-              <w:t>registrada</w:t>
-            </w:r>
-            <w:proofErr w:type="spellEnd"/>
-            <w:r>
-              <w:rPr>
-                <w:sz w:val="24"/>
-                <w:szCs w:val="24"/>
-                <w:lang w:val="en-US"/>
-              </w:rPr>
-              <w:t xml:space="preserve"> </w:t>
-            </w:r>
-            <w:proofErr w:type="spellStart"/>
-            <w:r>
-              <w:rPr>
-                <w:sz w:val="24"/>
-                <w:szCs w:val="24"/>
-                <w:lang w:val="en-US"/>
-              </w:rPr>
-              <w:t>en</w:t>
-            </w:r>
-            <w:proofErr w:type="spellEnd"/>
-            <w:r>
-              <w:rPr>
-                <w:sz w:val="24"/>
-                <w:szCs w:val="24"/>
-                <w:lang w:val="en-US"/>
-              </w:rPr>
-              <w:t xml:space="preserve"> BD</w:t>
+              <w:t>Acción registrada en BD</w:t>
             </w:r>
           </w:p>
         </w:tc>
@@ -9639,52 +8213,14 @@
                 <w:lang w:val="en-US"/>
               </w:rPr>
             </w:pPr>
-            <w:proofErr w:type="spellStart"/>
             <w:r>
               <w:rPr>
                 <w:sz w:val="24"/>
                 <w:szCs w:val="24"/>
                 <w:lang w:val="en-US"/>
               </w:rPr>
-              <w:t>Registro</w:t>
-            </w:r>
-            <w:proofErr w:type="spellEnd"/>
-            <w:r>
-              <w:rPr>
-                <w:sz w:val="24"/>
-                <w:szCs w:val="24"/>
-                <w:lang w:val="en-US"/>
-              </w:rPr>
-              <w:t xml:space="preserve"> de </w:t>
-            </w:r>
-            <w:proofErr w:type="spellStart"/>
-            <w:r>
-              <w:rPr>
-                <w:sz w:val="24"/>
-                <w:szCs w:val="24"/>
-                <w:lang w:val="en-US"/>
-              </w:rPr>
-              <w:t>intento</w:t>
-            </w:r>
-            <w:proofErr w:type="spellEnd"/>
-            <w:r>
-              <w:rPr>
-                <w:sz w:val="24"/>
-                <w:szCs w:val="24"/>
-                <w:lang w:val="en-US"/>
-              </w:rPr>
-              <w:t xml:space="preserve"> </w:t>
-            </w:r>
-            <w:proofErr w:type="spellStart"/>
-            <w:r>
-              <w:rPr>
-                <w:sz w:val="24"/>
-                <w:szCs w:val="24"/>
-                <w:lang w:val="en-US"/>
-              </w:rPr>
-              <w:t>fallido</w:t>
-            </w:r>
-            <w:proofErr w:type="spellEnd"/>
+              <w:t>Registro de intento fallido</w:t>
+            </w:r>
           </w:p>
         </w:tc>
       </w:tr>
@@ -9889,34 +8425,14 @@
                 <w:lang w:val="en-US"/>
               </w:rPr>
             </w:pPr>
-            <w:proofErr w:type="spellStart"/>
             <w:r>
               <w:rPr>
                 <w:sz w:val="24"/>
                 <w:szCs w:val="24"/>
                 <w:lang w:val="en-US"/>
               </w:rPr>
-              <w:t>Archivo</w:t>
-            </w:r>
-            <w:proofErr w:type="spellEnd"/>
-            <w:r>
-              <w:rPr>
-                <w:sz w:val="24"/>
-                <w:szCs w:val="24"/>
-                <w:lang w:val="en-US"/>
-              </w:rPr>
-              <w:t xml:space="preserve"> CSV </w:t>
-            </w:r>
-            <w:proofErr w:type="spellStart"/>
-            <w:r>
-              <w:rPr>
-                <w:sz w:val="24"/>
-                <w:szCs w:val="24"/>
-                <w:lang w:val="en-US"/>
-              </w:rPr>
-              <w:t>generado</w:t>
-            </w:r>
-            <w:proofErr w:type="spellEnd"/>
+              <w:t>Archivo CSV generado</w:t>
+            </w:r>
           </w:p>
         </w:tc>
       </w:tr>
@@ -10127,43 +8643,7 @@
                 <w:szCs w:val="24"/>
                 <w:lang w:val="en-US"/>
               </w:rPr>
-              <w:t xml:space="preserve">Sin </w:t>
-            </w:r>
-            <w:proofErr w:type="spellStart"/>
-            <w:r>
-              <w:rPr>
-                <w:sz w:val="24"/>
-                <w:szCs w:val="24"/>
-                <w:lang w:val="en-US"/>
-              </w:rPr>
-              <w:t>registro</w:t>
-            </w:r>
-            <w:proofErr w:type="spellEnd"/>
-            <w:r>
-              <w:rPr>
-                <w:sz w:val="24"/>
-                <w:szCs w:val="24"/>
-                <w:lang w:val="en-US"/>
-              </w:rPr>
-              <w:t xml:space="preserve"> </w:t>
-            </w:r>
-            <w:proofErr w:type="spellStart"/>
-            <w:r>
-              <w:rPr>
-                <w:sz w:val="24"/>
-                <w:szCs w:val="24"/>
-                <w:lang w:val="en-US"/>
-              </w:rPr>
-              <w:t>en</w:t>
-            </w:r>
-            <w:proofErr w:type="spellEnd"/>
-            <w:r>
-              <w:rPr>
-                <w:sz w:val="24"/>
-                <w:szCs w:val="24"/>
-                <w:lang w:val="en-US"/>
-              </w:rPr>
-              <w:t xml:space="preserve"> BD</w:t>
+              <w:t>Sin registro en BD</w:t>
             </w:r>
           </w:p>
         </w:tc>
@@ -10194,20 +8674,8 @@
           <w:szCs w:val="24"/>
           <w:lang w:val="en-US"/>
         </w:rPr>
-        <w:t xml:space="preserve">Valores de </w:t>
-      </w:r>
-      <w:proofErr w:type="spellStart"/>
-      <w:r>
-        <w:rPr>
-          <w:b/>
-          <w:bCs/>
-          <w:sz w:val="24"/>
-          <w:szCs w:val="24"/>
-          <w:lang w:val="en-US"/>
-        </w:rPr>
-        <w:t>Prueba</w:t>
-      </w:r>
-      <w:proofErr w:type="spellEnd"/>
+        <w:t>Valores de Prueba</w:t>
+      </w:r>
     </w:p>
     <w:p>
       <w:pPr>
@@ -10299,7 +8767,6 @@
                 <w:lang w:val="en-US"/>
               </w:rPr>
             </w:pPr>
-            <w:proofErr w:type="spellStart"/>
             <w:r>
               <w:rPr>
                 <w:b/>
@@ -10308,31 +8775,8 @@
                 <w:szCs w:val="24"/>
                 <w:lang w:val="en-US"/>
               </w:rPr>
-              <w:t>Acción</w:t>
-            </w:r>
-            <w:proofErr w:type="spellEnd"/>
-            <w:r>
-              <w:rPr>
-                <w:b/>
-                <w:bCs/>
-                <w:sz w:val="24"/>
-                <w:szCs w:val="24"/>
-                <w:lang w:val="en-US"/>
-              </w:rPr>
-              <w:t xml:space="preserve"> </w:t>
-            </w:r>
-            <w:proofErr w:type="spellStart"/>
-            <w:r>
-              <w:rPr>
-                <w:b/>
-                <w:bCs/>
-                <w:sz w:val="24"/>
-                <w:szCs w:val="24"/>
-                <w:lang w:val="en-US"/>
-              </w:rPr>
-              <w:t>realizada</w:t>
-            </w:r>
-            <w:proofErr w:type="spellEnd"/>
+              <w:t>Acción realizada</w:t>
+            </w:r>
           </w:p>
         </w:tc>
         <w:tc>
@@ -10405,20 +8849,8 @@
                 <w:szCs w:val="24"/>
                 <w:lang w:val="en-US"/>
               </w:rPr>
-              <w:t xml:space="preserve">Logs </w:t>
-            </w:r>
-            <w:proofErr w:type="spellStart"/>
-            <w:r>
-              <w:rPr>
-                <w:b/>
-                <w:bCs/>
-                <w:sz w:val="24"/>
-                <w:szCs w:val="24"/>
-                <w:lang w:val="en-US"/>
-              </w:rPr>
-              <w:t>activos</w:t>
-            </w:r>
-            <w:proofErr w:type="spellEnd"/>
+              <w:t>Logs activos</w:t>
+            </w:r>
           </w:p>
         </w:tc>
         <w:tc>
@@ -10446,7 +8878,6 @@
                 <w:lang w:val="en-US"/>
               </w:rPr>
             </w:pPr>
-            <w:proofErr w:type="spellStart"/>
             <w:r>
               <w:rPr>
                 <w:b/>
@@ -10455,31 +8886,8 @@
                 <w:szCs w:val="24"/>
                 <w:lang w:val="en-US"/>
               </w:rPr>
-              <w:t>Resultado</w:t>
-            </w:r>
-            <w:proofErr w:type="spellEnd"/>
-            <w:r>
-              <w:rPr>
-                <w:b/>
-                <w:bCs/>
-                <w:sz w:val="24"/>
-                <w:szCs w:val="24"/>
-                <w:lang w:val="en-US"/>
-              </w:rPr>
-              <w:t xml:space="preserve"> </w:t>
-            </w:r>
-            <w:proofErr w:type="spellStart"/>
-            <w:r>
-              <w:rPr>
-                <w:b/>
-                <w:bCs/>
-                <w:sz w:val="24"/>
-                <w:szCs w:val="24"/>
-                <w:lang w:val="en-US"/>
-              </w:rPr>
-              <w:t>Esperado</w:t>
-            </w:r>
-            <w:proofErr w:type="spellEnd"/>
+              <w:t>Resultado Esperado</w:t>
+            </w:r>
           </w:p>
         </w:tc>
       </w:tr>
@@ -10544,41 +8952,13 @@
                 <w:lang w:val="en-US"/>
               </w:rPr>
             </w:pPr>
-            <w:proofErr w:type="spellStart"/>
             <w:r>
               <w:rPr>
                 <w:sz w:val="24"/>
                 <w:szCs w:val="24"/>
                 <w:lang w:val="en-US"/>
               </w:rPr>
-              <w:t>Eliminar</w:t>
-            </w:r>
-            <w:proofErr w:type="spellEnd"/>
-            <w:r>
-              <w:rPr>
-                <w:sz w:val="24"/>
-                <w:szCs w:val="24"/>
-                <w:lang w:val="en-US"/>
-              </w:rPr>
-              <w:t xml:space="preserve"> </w:t>
-            </w:r>
-            <w:proofErr w:type="spellStart"/>
-            <w:r>
-              <w:rPr>
-                <w:sz w:val="24"/>
-                <w:szCs w:val="24"/>
-                <w:lang w:val="en-US"/>
-              </w:rPr>
-              <w:t>producto</w:t>
-            </w:r>
-            <w:proofErr w:type="spellEnd"/>
-            <w:r>
-              <w:rPr>
-                <w:sz w:val="24"/>
-                <w:szCs w:val="24"/>
-                <w:lang w:val="en-US"/>
-              </w:rPr>
-              <w:t xml:space="preserve"> ID: 45</w:t>
+              <w:t>Eliminar producto ID: 45</w:t>
             </w:r>
           </w:p>
         </w:tc>
@@ -10613,18 +8993,8 @@
                 <w:szCs w:val="24"/>
                 <w:lang w:val="en-US"/>
               </w:rPr>
-              <w:t xml:space="preserve">Marisol </w:t>
-            </w:r>
-            <w:proofErr w:type="spellStart"/>
-            <w:r>
-              <w:rPr>
-                <w:sz w:val="24"/>
-                <w:szCs w:val="24"/>
-                <w:lang w:val="en-US"/>
-              </w:rPr>
-              <w:t>Garz</w:t>
-            </w:r>
-            <w:proofErr w:type="spellEnd"/>
+              <w:t>Marisol Garz</w:t>
+            </w:r>
           </w:p>
         </w:tc>
         <w:tc>
@@ -10759,77 +9129,13 @@
                 <w:lang w:val="en-US"/>
               </w:rPr>
             </w:pPr>
-            <w:proofErr w:type="spellStart"/>
             <w:r>
               <w:rPr>
                 <w:sz w:val="24"/>
                 <w:szCs w:val="24"/>
                 <w:lang w:val="en-US"/>
               </w:rPr>
-              <w:t>Editar</w:t>
-            </w:r>
-            <w:proofErr w:type="spellEnd"/>
-            <w:r>
-              <w:rPr>
-                <w:sz w:val="24"/>
-                <w:szCs w:val="24"/>
-                <w:lang w:val="en-US"/>
-              </w:rPr>
-              <w:t xml:space="preserve"> </w:t>
-            </w:r>
-            <w:proofErr w:type="spellStart"/>
-            <w:r>
-              <w:rPr>
-                <w:sz w:val="24"/>
-                <w:szCs w:val="24"/>
-                <w:lang w:val="en-US"/>
-              </w:rPr>
-              <w:t>costo</w:t>
-            </w:r>
-            <w:proofErr w:type="spellEnd"/>
-            <w:r>
-              <w:rPr>
-                <w:sz w:val="24"/>
-                <w:szCs w:val="24"/>
-                <w:lang w:val="en-US"/>
-              </w:rPr>
-              <w:t xml:space="preserve"> (</w:t>
-            </w:r>
-            <w:proofErr w:type="spellStart"/>
-            <w:r>
-              <w:rPr>
-                <w:sz w:val="24"/>
-                <w:szCs w:val="24"/>
-                <w:lang w:val="en-US"/>
-              </w:rPr>
-              <w:t>formato</w:t>
-            </w:r>
-            <w:proofErr w:type="spellEnd"/>
-            <w:r>
-              <w:rPr>
-                <w:sz w:val="24"/>
-                <w:szCs w:val="24"/>
-                <w:lang w:val="en-US"/>
-              </w:rPr>
-              <w:t xml:space="preserve"> </w:t>
-            </w:r>
-            <w:proofErr w:type="spellStart"/>
-            <w:r>
-              <w:rPr>
-                <w:sz w:val="24"/>
-                <w:szCs w:val="24"/>
-                <w:lang w:val="en-US"/>
-              </w:rPr>
-              <w:t>invalido</w:t>
-            </w:r>
-            <w:proofErr w:type="spellEnd"/>
-            <w:r>
-              <w:rPr>
-                <w:sz w:val="24"/>
-                <w:szCs w:val="24"/>
-                <w:lang w:val="en-US"/>
-              </w:rPr>
-              <w:t>)</w:t>
+              <w:t>Editar costo (formato invalido)</w:t>
             </w:r>
           </w:p>
         </w:tc>
@@ -10864,18 +9170,8 @@
                 <w:szCs w:val="24"/>
                 <w:lang w:val="en-US"/>
               </w:rPr>
-              <w:t xml:space="preserve">Jorge </w:t>
-            </w:r>
-            <w:proofErr w:type="spellStart"/>
-            <w:r>
-              <w:rPr>
-                <w:sz w:val="24"/>
-                <w:szCs w:val="24"/>
-                <w:lang w:val="en-US"/>
-              </w:rPr>
-              <w:t>Oyoqui</w:t>
-            </w:r>
-            <w:proofErr w:type="spellEnd"/>
+              <w:t>Jorge Oyoqui</w:t>
+            </w:r>
           </w:p>
         </w:tc>
         <w:tc>
@@ -11010,23 +9306,13 @@
                 <w:lang w:val="en-US"/>
               </w:rPr>
             </w:pPr>
-            <w:proofErr w:type="spellStart"/>
             <w:r>
               <w:rPr>
                 <w:sz w:val="24"/>
                 <w:szCs w:val="24"/>
                 <w:lang w:val="en-US"/>
               </w:rPr>
-              <w:t>Exportar</w:t>
-            </w:r>
-            <w:proofErr w:type="spellEnd"/>
-            <w:r>
-              <w:rPr>
-                <w:sz w:val="24"/>
-                <w:szCs w:val="24"/>
-                <w:lang w:val="en-US"/>
-              </w:rPr>
-              <w:t xml:space="preserve"> logs (01/01/2025 - 31/01/2025)</w:t>
+              <w:t>Exportar logs (01/01/2025 - 31/01/2025)</w:t>
             </w:r>
           </w:p>
         </w:tc>
@@ -11197,34 +9483,14 @@
                 <w:lang w:val="en-US"/>
               </w:rPr>
             </w:pPr>
-            <w:proofErr w:type="spellStart"/>
             <w:r>
               <w:rPr>
                 <w:sz w:val="24"/>
                 <w:szCs w:val="24"/>
                 <w:lang w:val="en-US"/>
               </w:rPr>
-              <w:t>Inicio</w:t>
-            </w:r>
-            <w:proofErr w:type="spellEnd"/>
-            <w:r>
-              <w:rPr>
-                <w:sz w:val="24"/>
-                <w:szCs w:val="24"/>
-                <w:lang w:val="en-US"/>
-              </w:rPr>
-              <w:t xml:space="preserve"> de </w:t>
-            </w:r>
-            <w:proofErr w:type="spellStart"/>
-            <w:r>
-              <w:rPr>
-                <w:sz w:val="24"/>
-                <w:szCs w:val="24"/>
-                <w:lang w:val="en-US"/>
-              </w:rPr>
-              <w:t>sesión</w:t>
-            </w:r>
-            <w:proofErr w:type="spellEnd"/>
+              <w:t>Inicio de sesión</w:t>
+            </w:r>
           </w:p>
         </w:tc>
         <w:tc>
@@ -11328,18 +9594,8 @@
                 <w:szCs w:val="24"/>
                 <w:lang w:val="en-US"/>
               </w:rPr>
-              <w:t xml:space="preserve">BD sin </w:t>
-            </w:r>
-            <w:proofErr w:type="spellStart"/>
-            <w:r>
-              <w:rPr>
-                <w:sz w:val="24"/>
-                <w:szCs w:val="24"/>
-                <w:lang w:val="en-US"/>
-              </w:rPr>
-              <w:t>registro</w:t>
-            </w:r>
-            <w:proofErr w:type="spellEnd"/>
+              <w:t>BD sin registro</w:t>
+            </w:r>
           </w:p>
         </w:tc>
       </w:tr>
@@ -11379,6 +9635,7 @@
       </w:r>
       <w:r>
         <w:rPr>
+          <w:noProof/>
           <w:sz w:val="24"/>
           <w:szCs w:val="24"/>
           <w:lang w:val="en-US"/>
@@ -11455,25 +9712,762 @@
           <w:szCs w:val="24"/>
           <w:lang w:val="es-MX"/>
         </w:rPr>
-        <w:t xml:space="preserve">rueba, como el diagrama de </w:t>
-      </w:r>
-      <w:proofErr w:type="spellStart"/>
-      <w:r>
-        <w:rPr>
-          <w:sz w:val="24"/>
-          <w:szCs w:val="24"/>
-          <w:lang w:val="es-MX"/>
-        </w:rPr>
-        <w:t>secuenca</w:t>
-      </w:r>
-      <w:proofErr w:type="spellEnd"/>
-      <w:r>
-        <w:rPr>
-          <w:sz w:val="24"/>
-          <w:szCs w:val="24"/>
-          <w:lang w:val="es-MX"/>
-        </w:rPr>
-        <w:t xml:space="preserve"> correspondiente dentro del documento del proyecto</w:t>
+        <w:t>rueba, como el diagrama de secuenca correspondiente dentro del documento del proyecto</w:t>
+      </w:r>
+      <w:r>
+        <w:rPr>
+          <w:sz w:val="24"/>
+          <w:szCs w:val="24"/>
+          <w:lang w:val="es-MX"/>
+        </w:rPr>
+        <w:t>\</w:t>
+      </w:r>
+    </w:p>
+    <w:p>
+      <w:pPr>
+        <w:rPr>
+          <w:sz w:val="24"/>
+          <w:szCs w:val="24"/>
+          <w:lang w:val="es-MX"/>
+        </w:rPr>
+      </w:pPr>
+    </w:p>
+    <w:p>
+      <w:pPr>
+        <w:rPr>
+          <w:sz w:val="24"/>
+          <w:szCs w:val="24"/>
+          <w:lang w:val="es-MX"/>
+        </w:rPr>
+      </w:pPr>
+    </w:p>
+    <w:p>
+      <w:pPr>
+        <w:rPr>
+          <w:sz w:val="24"/>
+          <w:szCs w:val="24"/>
+          <w:lang w:val="es-MX"/>
+        </w:rPr>
+      </w:pPr>
+      <w:r>
+        <w:rPr>
+          <w:sz w:val="24"/>
+          <w:szCs w:val="24"/>
+          <w:lang w:val="es-MX"/>
+        </w:rPr>
+        <w:t>Dentro del proyecto otra de las actividades que realizze fue subir el proyecto al servidor, actualmente sigo manejando el servidor y la conexión con la db, además de asignarle el dominio a la app. Aparte de eso participe en la creación del manual de instalación del proyecto</w:t>
+      </w:r>
+    </w:p>
+    <w:p>
+      <w:pPr>
+        <w:rPr>
+          <w:sz w:val="24"/>
+          <w:szCs w:val="24"/>
+          <w:lang w:val="es-MX"/>
+        </w:rPr>
+      </w:pPr>
+    </w:p>
+    <w:p>
+      <w:pPr>
+        <w:rPr>
+          <w:sz w:val="24"/>
+          <w:szCs w:val="24"/>
+          <w:lang w:val="es-MX"/>
+        </w:rPr>
+      </w:pPr>
+      <w:r>
+        <w:rPr>
+          <w:sz w:val="24"/>
+          <w:szCs w:val="24"/>
+          <w:lang w:val="en-US"/>
+        </w:rPr>
+        <w:drawing>
+          <wp:inline distT="0" distB="0" distL="0" distR="0" wp14:anchorId="1C8B8DD4" wp14:editId="243A340C">
+            <wp:extent cx="4356100" cy="2641600"/>
+            <wp:effectExtent l="0" t="0" r="6350" b="6350"/>
+            <wp:docPr id="1936730867" name="Picture 16" descr="A screenshot of a computer&#10;&#10;AI-generated content may be incorrect."/>
+            <wp:cNvGraphicFramePr>
+              <a:graphicFrameLocks xmlns:a="http://schemas.openxmlformats.org/drawingml/2006/main" noChangeAspect="1"/>
+            </wp:cNvGraphicFramePr>
+            <a:graphic xmlns:a="http://schemas.openxmlformats.org/drawingml/2006/main">
+              <a:graphicData uri="http://schemas.openxmlformats.org/drawingml/2006/picture">
+                <pic:pic xmlns:pic="http://schemas.openxmlformats.org/drawingml/2006/picture">
+                  <pic:nvPicPr>
+                    <pic:cNvPr id="1936730867" name="Picture 16" descr="A screenshot of a computer&#10;&#10;AI-generated content may be incorrect."/>
+                    <pic:cNvPicPr>
+                      <a:picLocks noChangeAspect="1" noChangeArrowheads="1"/>
+                    </pic:cNvPicPr>
+                  </pic:nvPicPr>
+                  <pic:blipFill>
+                    <a:blip r:embed="rId20">
+                      <a:extLst>
+                        <a:ext uri="{28A0092B-C50C-407E-A947-70E740481C1C}">
+                          <a14:useLocalDpi xmlns:a14="http://schemas.microsoft.com/office/drawing/2010/main" val="0"/>
+                        </a:ext>
+                      </a:extLst>
+                    </a:blip>
+                    <a:srcRect/>
+                    <a:stretch>
+                      <a:fillRect/>
+                    </a:stretch>
+                  </pic:blipFill>
+                  <pic:spPr bwMode="auto">
+                    <a:xfrm>
+                      <a:off x="0" y="0"/>
+                      <a:ext cx="4356100" cy="2641600"/>
+                    </a:xfrm>
+                    <a:prstGeom prst="rect">
+                      <a:avLst/>
+                    </a:prstGeom>
+                    <a:noFill/>
+                    <a:ln>
+                      <a:noFill/>
+                    </a:ln>
+                  </pic:spPr>
+                </pic:pic>
+              </a:graphicData>
+            </a:graphic>
+          </wp:inline>
+        </w:drawing>
+      </w:r>
+      <w:r>
+        <w:rPr>
+          <w:sz w:val="24"/>
+          <w:szCs w:val="24"/>
+          <w:lang w:val="es-MX"/>
+        </w:rPr>
+        <w:t>\</w:t>
+      </w:r>
+    </w:p>
+    <w:p>
+      <w:pPr>
+        <w:rPr>
+          <w:sz w:val="24"/>
+          <w:szCs w:val="24"/>
+          <w:lang w:val="es-MX"/>
+        </w:rPr>
+      </w:pPr>
+      <w:r>
+        <w:rPr>
+          <w:sz w:val="24"/>
+          <w:szCs w:val="24"/>
+          <w:lang w:val="es-MX"/>
+        </w:rPr>
+        <w:t>Ahora deberemos crear una nueva db dentro del servidor</w:t>
+      </w:r>
+    </w:p>
+    <w:p>
+      <w:pPr>
+        <w:rPr>
+          <w:sz w:val="24"/>
+          <w:szCs w:val="24"/>
+          <w:lang w:val="en-US"/>
+        </w:rPr>
+      </w:pPr>
+      <w:r>
+        <w:rPr>
+          <w:sz w:val="24"/>
+          <w:szCs w:val="24"/>
+          <w:lang w:val="en-US"/>
+        </w:rPr>
+        <w:lastRenderedPageBreak/>
+        <w:drawing>
+          <wp:inline distT="0" distB="0" distL="0" distR="0" wp14:anchorId="30CCC712" wp14:editId="67EB870D">
+            <wp:extent cx="4641850" cy="2698750"/>
+            <wp:effectExtent l="0" t="0" r="6350" b="6350"/>
+            <wp:docPr id="407473785" name="Picture 15" descr="A screenshot of a computer&#10;&#10;AI-generated content may be incorrect."/>
+            <wp:cNvGraphicFramePr>
+              <a:graphicFrameLocks xmlns:a="http://schemas.openxmlformats.org/drawingml/2006/main" noChangeAspect="1"/>
+            </wp:cNvGraphicFramePr>
+            <a:graphic xmlns:a="http://schemas.openxmlformats.org/drawingml/2006/main">
+              <a:graphicData uri="http://schemas.openxmlformats.org/drawingml/2006/picture">
+                <pic:pic xmlns:pic="http://schemas.openxmlformats.org/drawingml/2006/picture">
+                  <pic:nvPicPr>
+                    <pic:cNvPr id="407473785" name="Picture 15" descr="A screenshot of a computer&#10;&#10;AI-generated content may be incorrect."/>
+                    <pic:cNvPicPr>
+                      <a:picLocks noChangeAspect="1" noChangeArrowheads="1"/>
+                    </pic:cNvPicPr>
+                  </pic:nvPicPr>
+                  <pic:blipFill>
+                    <a:blip r:embed="rId21">
+                      <a:extLst>
+                        <a:ext uri="{28A0092B-C50C-407E-A947-70E740481C1C}">
+                          <a14:useLocalDpi xmlns:a14="http://schemas.microsoft.com/office/drawing/2010/main" val="0"/>
+                        </a:ext>
+                      </a:extLst>
+                    </a:blip>
+                    <a:srcRect/>
+                    <a:stretch>
+                      <a:fillRect/>
+                    </a:stretch>
+                  </pic:blipFill>
+                  <pic:spPr bwMode="auto">
+                    <a:xfrm>
+                      <a:off x="0" y="0"/>
+                      <a:ext cx="4641850" cy="2698750"/>
+                    </a:xfrm>
+                    <a:prstGeom prst="rect">
+                      <a:avLst/>
+                    </a:prstGeom>
+                    <a:noFill/>
+                    <a:ln>
+                      <a:noFill/>
+                    </a:ln>
+                  </pic:spPr>
+                </pic:pic>
+              </a:graphicData>
+            </a:graphic>
+          </wp:inline>
+        </w:drawing>
+      </w:r>
+    </w:p>
+    <w:p>
+      <w:pPr>
+        <w:rPr>
+          <w:sz w:val="24"/>
+          <w:szCs w:val="24"/>
+          <w:lang w:val="es-MX"/>
+        </w:rPr>
+      </w:pPr>
+      <w:r>
+        <w:rPr>
+          <w:sz w:val="24"/>
+          <w:szCs w:val="24"/>
+          <w:lang w:val="es-MX"/>
+        </w:rPr>
+        <w:t>Aquí deberemos agregar el nombre nuestra db, recuerda tener la misma configuración que tienes en la db anterior, de lo contrario no funcionará tu archivo.</w:t>
+      </w:r>
+    </w:p>
+    <w:p>
+      <w:pPr>
+        <w:rPr>
+          <w:sz w:val="24"/>
+          <w:szCs w:val="24"/>
+          <w:lang w:val="es-MX"/>
+        </w:rPr>
+      </w:pPr>
+      <w:r>
+        <w:rPr>
+          <w:sz w:val="24"/>
+          <w:szCs w:val="24"/>
+          <w:lang w:val="es-MX"/>
+        </w:rPr>
+        <w:t>Dando click ahora en Restore db, deberá de mandarnos a otra ventana </w:t>
+      </w:r>
+    </w:p>
+    <w:p>
+      <w:pPr>
+        <w:rPr>
+          <w:sz w:val="24"/>
+          <w:szCs w:val="24"/>
+          <w:lang w:val="en-US"/>
+        </w:rPr>
+      </w:pPr>
+      <w:r>
+        <w:rPr>
+          <w:sz w:val="24"/>
+          <w:szCs w:val="24"/>
+          <w:lang w:val="en-US"/>
+        </w:rPr>
+        <w:lastRenderedPageBreak/>
+        <w:drawing>
+          <wp:inline distT="0" distB="0" distL="0" distR="0" wp14:anchorId="3AFDDB33" wp14:editId="34E4FA8E">
+            <wp:extent cx="5733415" cy="4317365"/>
+            <wp:effectExtent l="0" t="0" r="635" b="6985"/>
+            <wp:docPr id="956195272" name="Picture 14" descr="A screenshot of a computer&#10;&#10;AI-generated content may be incorrect."/>
+            <wp:cNvGraphicFramePr>
+              <a:graphicFrameLocks xmlns:a="http://schemas.openxmlformats.org/drawingml/2006/main" noChangeAspect="1"/>
+            </wp:cNvGraphicFramePr>
+            <a:graphic xmlns:a="http://schemas.openxmlformats.org/drawingml/2006/main">
+              <a:graphicData uri="http://schemas.openxmlformats.org/drawingml/2006/picture">
+                <pic:pic xmlns:pic="http://schemas.openxmlformats.org/drawingml/2006/picture">
+                  <pic:nvPicPr>
+                    <pic:cNvPr id="956195272" name="Picture 14" descr="A screenshot of a computer&#10;&#10;AI-generated content may be incorrect."/>
+                    <pic:cNvPicPr>
+                      <a:picLocks noChangeAspect="1" noChangeArrowheads="1"/>
+                    </pic:cNvPicPr>
+                  </pic:nvPicPr>
+                  <pic:blipFill>
+                    <a:blip r:embed="rId22">
+                      <a:extLst>
+                        <a:ext uri="{28A0092B-C50C-407E-A947-70E740481C1C}">
+                          <a14:useLocalDpi xmlns:a14="http://schemas.microsoft.com/office/drawing/2010/main" val="0"/>
+                        </a:ext>
+                      </a:extLst>
+                    </a:blip>
+                    <a:srcRect/>
+                    <a:stretch>
+                      <a:fillRect/>
+                    </a:stretch>
+                  </pic:blipFill>
+                  <pic:spPr bwMode="auto">
+                    <a:xfrm>
+                      <a:off x="0" y="0"/>
+                      <a:ext cx="5733415" cy="4317365"/>
+                    </a:xfrm>
+                    <a:prstGeom prst="rect">
+                      <a:avLst/>
+                    </a:prstGeom>
+                    <a:noFill/>
+                    <a:ln>
+                      <a:noFill/>
+                    </a:ln>
+                  </pic:spPr>
+                </pic:pic>
+              </a:graphicData>
+            </a:graphic>
+          </wp:inline>
+        </w:drawing>
+      </w:r>
+      <w:r>
+        <w:rPr>
+          <w:sz w:val="24"/>
+          <w:szCs w:val="24"/>
+          <w:lang w:val="en-US"/>
+        </w:rPr>
+        <w:drawing>
+          <wp:inline distT="0" distB="0" distL="0" distR="0" wp14:anchorId="37CF0F51" wp14:editId="4F6CDB86">
+            <wp:extent cx="5733415" cy="2945765"/>
+            <wp:effectExtent l="0" t="0" r="635" b="6985"/>
+            <wp:docPr id="1961714991" name="Picture 13" descr="A screenshot of a computer&#10;&#10;AI-generated content may be incorrect."/>
+            <wp:cNvGraphicFramePr>
+              <a:graphicFrameLocks xmlns:a="http://schemas.openxmlformats.org/drawingml/2006/main" noChangeAspect="1"/>
+            </wp:cNvGraphicFramePr>
+            <a:graphic xmlns:a="http://schemas.openxmlformats.org/drawingml/2006/main">
+              <a:graphicData uri="http://schemas.openxmlformats.org/drawingml/2006/picture">
+                <pic:pic xmlns:pic="http://schemas.openxmlformats.org/drawingml/2006/picture">
+                  <pic:nvPicPr>
+                    <pic:cNvPr id="1961714991" name="Picture 13" descr="A screenshot of a computer&#10;&#10;AI-generated content may be incorrect."/>
+                    <pic:cNvPicPr>
+                      <a:picLocks noChangeAspect="1" noChangeArrowheads="1"/>
+                    </pic:cNvPicPr>
+                  </pic:nvPicPr>
+                  <pic:blipFill>
+                    <a:blip r:embed="rId23">
+                      <a:extLst>
+                        <a:ext uri="{28A0092B-C50C-407E-A947-70E740481C1C}">
+                          <a14:useLocalDpi xmlns:a14="http://schemas.microsoft.com/office/drawing/2010/main" val="0"/>
+                        </a:ext>
+                      </a:extLst>
+                    </a:blip>
+                    <a:srcRect/>
+                    <a:stretch>
+                      <a:fillRect/>
+                    </a:stretch>
+                  </pic:blipFill>
+                  <pic:spPr bwMode="auto">
+                    <a:xfrm>
+                      <a:off x="0" y="0"/>
+                      <a:ext cx="5733415" cy="2945765"/>
+                    </a:xfrm>
+                    <a:prstGeom prst="rect">
+                      <a:avLst/>
+                    </a:prstGeom>
+                    <a:noFill/>
+                    <a:ln>
+                      <a:noFill/>
+                    </a:ln>
+                  </pic:spPr>
+                </pic:pic>
+              </a:graphicData>
+            </a:graphic>
+          </wp:inline>
+        </w:drawing>
+      </w:r>
+    </w:p>
+    <w:p>
+      <w:pPr>
+        <w:rPr>
+          <w:sz w:val="24"/>
+          <w:szCs w:val="24"/>
+          <w:lang w:val="es-MX"/>
+        </w:rPr>
+      </w:pPr>
+      <w:r>
+        <w:rPr>
+          <w:sz w:val="24"/>
+          <w:szCs w:val="24"/>
+          <w:lang w:val="es-MX"/>
+        </w:rPr>
+        <w:t>Aqui deberas buscar y seleccionar tu archivo, si todo funciona correctamente no marcara ningún error. De lo contrario algo esta mal en la configuración de tu db</w:t>
+      </w:r>
+    </w:p>
+    <w:p>
+      <w:pPr>
+        <w:rPr>
+          <w:sz w:val="24"/>
+          <w:szCs w:val="24"/>
+          <w:lang w:val="es-MX"/>
+        </w:rPr>
+      </w:pPr>
+    </w:p>
+    <w:p>
+      <w:pPr>
+        <w:rPr>
+          <w:sz w:val="24"/>
+          <w:szCs w:val="24"/>
+          <w:lang w:val="es-MX"/>
+        </w:rPr>
+      </w:pPr>
+      <w:r>
+        <w:rPr>
+          <w:sz w:val="24"/>
+          <w:szCs w:val="24"/>
+          <w:lang w:val="es-MX"/>
+        </w:rPr>
+        <w:t>Ahora en caso de querer un dominio deberemos correr esto en la terminal del servidor</w:t>
+      </w:r>
+    </w:p>
+    <w:p>
+      <w:pPr>
+        <w:rPr>
+          <w:sz w:val="24"/>
+          <w:szCs w:val="24"/>
+          <w:lang w:val="en-US"/>
+        </w:rPr>
+      </w:pPr>
+      <w:r>
+        <w:rPr>
+          <w:sz w:val="24"/>
+          <w:szCs w:val="24"/>
+          <w:lang w:val="en-US"/>
+        </w:rPr>
+        <w:lastRenderedPageBreak/>
+        <w:drawing>
+          <wp:inline distT="0" distB="0" distL="0" distR="0" wp14:anchorId="1D8B5D76" wp14:editId="3287032A">
+            <wp:extent cx="5733415" cy="571500"/>
+            <wp:effectExtent l="0" t="0" r="635" b="0"/>
+            <wp:docPr id="356012178" name="Picture 12"/>
+            <wp:cNvGraphicFramePr>
+              <a:graphicFrameLocks xmlns:a="http://schemas.openxmlformats.org/drawingml/2006/main" noChangeAspect="1"/>
+            </wp:cNvGraphicFramePr>
+            <a:graphic xmlns:a="http://schemas.openxmlformats.org/drawingml/2006/main">
+              <a:graphicData uri="http://schemas.openxmlformats.org/drawingml/2006/picture">
+                <pic:pic xmlns:pic="http://schemas.openxmlformats.org/drawingml/2006/picture">
+                  <pic:nvPicPr>
+                    <pic:cNvPr id="0" name="Picture 45"/>
+                    <pic:cNvPicPr>
+                      <a:picLocks noChangeAspect="1" noChangeArrowheads="1"/>
+                    </pic:cNvPicPr>
+                  </pic:nvPicPr>
+                  <pic:blipFill>
+                    <a:blip r:embed="rId24">
+                      <a:extLst>
+                        <a:ext uri="{28A0092B-C50C-407E-A947-70E740481C1C}">
+                          <a14:useLocalDpi xmlns:a14="http://schemas.microsoft.com/office/drawing/2010/main" val="0"/>
+                        </a:ext>
+                      </a:extLst>
+                    </a:blip>
+                    <a:srcRect/>
+                    <a:stretch>
+                      <a:fillRect/>
+                    </a:stretch>
+                  </pic:blipFill>
+                  <pic:spPr bwMode="auto">
+                    <a:xfrm>
+                      <a:off x="0" y="0"/>
+                      <a:ext cx="5733415" cy="571500"/>
+                    </a:xfrm>
+                    <a:prstGeom prst="rect">
+                      <a:avLst/>
+                    </a:prstGeom>
+                    <a:noFill/>
+                    <a:ln>
+                      <a:noFill/>
+                    </a:ln>
+                  </pic:spPr>
+                </pic:pic>
+              </a:graphicData>
+            </a:graphic>
+          </wp:inline>
+        </w:drawing>
+      </w:r>
+    </w:p>
+    <w:p>
+      <w:pPr>
+        <w:rPr>
+          <w:sz w:val="24"/>
+          <w:szCs w:val="24"/>
+          <w:lang w:val="en-US"/>
+        </w:rPr>
+      </w:pPr>
+      <w:r>
+        <w:rPr>
+          <w:sz w:val="24"/>
+          <w:szCs w:val="24"/>
+          <w:lang w:val="en-US"/>
+        </w:rPr>
+        <w:drawing>
+          <wp:inline distT="0" distB="0" distL="0" distR="0" wp14:anchorId="068D32D7" wp14:editId="1E2E7787">
+            <wp:extent cx="5733415" cy="1022350"/>
+            <wp:effectExtent l="0" t="0" r="635" b="6350"/>
+            <wp:docPr id="373348719" name="Picture 11" descr="A screen shot of a computer&#10;&#10;AI-generated content may be incorrect."/>
+            <wp:cNvGraphicFramePr>
+              <a:graphicFrameLocks xmlns:a="http://schemas.openxmlformats.org/drawingml/2006/main" noChangeAspect="1"/>
+            </wp:cNvGraphicFramePr>
+            <a:graphic xmlns:a="http://schemas.openxmlformats.org/drawingml/2006/main">
+              <a:graphicData uri="http://schemas.openxmlformats.org/drawingml/2006/picture">
+                <pic:pic xmlns:pic="http://schemas.openxmlformats.org/drawingml/2006/picture">
+                  <pic:nvPicPr>
+                    <pic:cNvPr id="373348719" name="Picture 11" descr="A screen shot of a computer&#10;&#10;AI-generated content may be incorrect."/>
+                    <pic:cNvPicPr>
+                      <a:picLocks noChangeAspect="1" noChangeArrowheads="1"/>
+                    </pic:cNvPicPr>
+                  </pic:nvPicPr>
+                  <pic:blipFill>
+                    <a:blip r:embed="rId25">
+                      <a:extLst>
+                        <a:ext uri="{28A0092B-C50C-407E-A947-70E740481C1C}">
+                          <a14:useLocalDpi xmlns:a14="http://schemas.microsoft.com/office/drawing/2010/main" val="0"/>
+                        </a:ext>
+                      </a:extLst>
+                    </a:blip>
+                    <a:srcRect/>
+                    <a:stretch>
+                      <a:fillRect/>
+                    </a:stretch>
+                  </pic:blipFill>
+                  <pic:spPr bwMode="auto">
+                    <a:xfrm>
+                      <a:off x="0" y="0"/>
+                      <a:ext cx="5733415" cy="1022350"/>
+                    </a:xfrm>
+                    <a:prstGeom prst="rect">
+                      <a:avLst/>
+                    </a:prstGeom>
+                    <a:noFill/>
+                    <a:ln>
+                      <a:noFill/>
+                    </a:ln>
+                  </pic:spPr>
+                </pic:pic>
+              </a:graphicData>
+            </a:graphic>
+          </wp:inline>
+        </w:drawing>
+      </w:r>
+    </w:p>
+    <w:p>
+      <w:pPr>
+        <w:rPr>
+          <w:sz w:val="24"/>
+          <w:szCs w:val="24"/>
+          <w:lang w:val="es-MX"/>
+        </w:rPr>
+      </w:pPr>
+      <w:r>
+        <w:rPr>
+          <w:sz w:val="24"/>
+          <w:szCs w:val="24"/>
+          <w:lang w:val="es-MX"/>
+        </w:rPr>
+        <w:t>Esto permite asignar un dominio y un certificado, ahora con este comando te saldra una pestaña nueva </w:t>
+      </w:r>
+    </w:p>
+    <w:p>
+      <w:pPr>
+        <w:rPr>
+          <w:sz w:val="24"/>
+          <w:szCs w:val="24"/>
+          <w:lang w:val="en-US"/>
+        </w:rPr>
+      </w:pPr>
+      <w:r>
+        <w:rPr>
+          <w:sz w:val="24"/>
+          <w:szCs w:val="24"/>
+          <w:lang w:val="en-US"/>
+        </w:rPr>
+        <w:drawing>
+          <wp:inline distT="0" distB="0" distL="0" distR="0" wp14:anchorId="71E413B5" wp14:editId="0F8A1B2F">
+            <wp:extent cx="5733415" cy="444500"/>
+            <wp:effectExtent l="0" t="0" r="635" b="0"/>
+            <wp:docPr id="1673358432" name="Picture 10"/>
+            <wp:cNvGraphicFramePr>
+              <a:graphicFrameLocks xmlns:a="http://schemas.openxmlformats.org/drawingml/2006/main" noChangeAspect="1"/>
+            </wp:cNvGraphicFramePr>
+            <a:graphic xmlns:a="http://schemas.openxmlformats.org/drawingml/2006/main">
+              <a:graphicData uri="http://schemas.openxmlformats.org/drawingml/2006/picture">
+                <pic:pic xmlns:pic="http://schemas.openxmlformats.org/drawingml/2006/picture">
+                  <pic:nvPicPr>
+                    <pic:cNvPr id="0" name="Picture 47"/>
+                    <pic:cNvPicPr>
+                      <a:picLocks noChangeAspect="1" noChangeArrowheads="1"/>
+                    </pic:cNvPicPr>
+                  </pic:nvPicPr>
+                  <pic:blipFill>
+                    <a:blip r:embed="rId26">
+                      <a:extLst>
+                        <a:ext uri="{28A0092B-C50C-407E-A947-70E740481C1C}">
+                          <a14:useLocalDpi xmlns:a14="http://schemas.microsoft.com/office/drawing/2010/main" val="0"/>
+                        </a:ext>
+                      </a:extLst>
+                    </a:blip>
+                    <a:srcRect/>
+                    <a:stretch>
+                      <a:fillRect/>
+                    </a:stretch>
+                  </pic:blipFill>
+                  <pic:spPr bwMode="auto">
+                    <a:xfrm>
+                      <a:off x="0" y="0"/>
+                      <a:ext cx="5733415" cy="444500"/>
+                    </a:xfrm>
+                    <a:prstGeom prst="rect">
+                      <a:avLst/>
+                    </a:prstGeom>
+                    <a:noFill/>
+                    <a:ln>
+                      <a:noFill/>
+                    </a:ln>
+                  </pic:spPr>
+                </pic:pic>
+              </a:graphicData>
+            </a:graphic>
+          </wp:inline>
+        </w:drawing>
+      </w:r>
+    </w:p>
+    <w:p>
+      <w:pPr>
+        <w:rPr>
+          <w:sz w:val="24"/>
+          <w:szCs w:val="24"/>
+          <w:lang w:val="en-US"/>
+        </w:rPr>
+      </w:pPr>
+      <w:r>
+        <w:rPr>
+          <w:sz w:val="24"/>
+          <w:szCs w:val="24"/>
+          <w:lang w:val="en-US"/>
+        </w:rPr>
+        <w:drawing>
+          <wp:inline distT="0" distB="0" distL="0" distR="0" wp14:anchorId="55D4EA08" wp14:editId="62F8693E">
+            <wp:extent cx="5733415" cy="3402965"/>
+            <wp:effectExtent l="0" t="0" r="635" b="6985"/>
+            <wp:docPr id="1774135477" name="Picture 9" descr="A screenshot of a computer&#10;&#10;AI-generated content may be incorrect."/>
+            <wp:cNvGraphicFramePr>
+              <a:graphicFrameLocks xmlns:a="http://schemas.openxmlformats.org/drawingml/2006/main" noChangeAspect="1"/>
+            </wp:cNvGraphicFramePr>
+            <a:graphic xmlns:a="http://schemas.openxmlformats.org/drawingml/2006/main">
+              <a:graphicData uri="http://schemas.openxmlformats.org/drawingml/2006/picture">
+                <pic:pic xmlns:pic="http://schemas.openxmlformats.org/drawingml/2006/picture">
+                  <pic:nvPicPr>
+                    <pic:cNvPr id="1774135477" name="Picture 9" descr="A screenshot of a computer&#10;&#10;AI-generated content may be incorrect."/>
+                    <pic:cNvPicPr>
+                      <a:picLocks noChangeAspect="1" noChangeArrowheads="1"/>
+                    </pic:cNvPicPr>
+                  </pic:nvPicPr>
+                  <pic:blipFill>
+                    <a:blip r:embed="rId27" cstate="print">
+                      <a:extLst>
+                        <a:ext uri="{28A0092B-C50C-407E-A947-70E740481C1C}">
+                          <a14:useLocalDpi xmlns:a14="http://schemas.microsoft.com/office/drawing/2010/main" val="0"/>
+                        </a:ext>
+                      </a:extLst>
+                    </a:blip>
+                    <a:srcRect/>
+                    <a:stretch>
+                      <a:fillRect/>
+                    </a:stretch>
+                  </pic:blipFill>
+                  <pic:spPr bwMode="auto">
+                    <a:xfrm>
+                      <a:off x="0" y="0"/>
+                      <a:ext cx="5733415" cy="3402965"/>
+                    </a:xfrm>
+                    <a:prstGeom prst="rect">
+                      <a:avLst/>
+                    </a:prstGeom>
+                    <a:noFill/>
+                    <a:ln>
+                      <a:noFill/>
+                    </a:ln>
+                  </pic:spPr>
+                </pic:pic>
+              </a:graphicData>
+            </a:graphic>
+          </wp:inline>
+        </w:drawing>
+      </w:r>
+    </w:p>
+    <w:p>
+      <w:pPr>
+        <w:rPr>
+          <w:sz w:val="24"/>
+          <w:szCs w:val="24"/>
+          <w:lang w:val="es-MX"/>
+        </w:rPr>
+      </w:pPr>
+      <w:r>
+        <w:rPr>
+          <w:sz w:val="24"/>
+          <w:szCs w:val="24"/>
+          <w:lang w:val="es-MX"/>
+        </w:rPr>
+        <w:t>Aqui deberan seguir esta configuracion basica para que se asigne a la app dentro del servidor</w:t>
+      </w:r>
+    </w:p>
+    <w:p>
+      <w:pPr>
+        <w:rPr>
+          <w:sz w:val="24"/>
+          <w:szCs w:val="24"/>
+          <w:lang w:val="es-MX"/>
+        </w:rPr>
+      </w:pPr>
+    </w:p>
+    <w:p>
+      <w:pPr>
+        <w:rPr>
+          <w:sz w:val="24"/>
+          <w:szCs w:val="24"/>
+          <w:lang w:val="es-MX"/>
+        </w:rPr>
+      </w:pPr>
+      <w:r>
+        <w:rPr>
+          <w:sz w:val="24"/>
+          <w:szCs w:val="24"/>
+          <w:lang w:val="es-MX"/>
+        </w:rPr>
+        <w:t>Si todo el proceso fue seguido exitosamente, podrán acceder a traves del dominio asignado a su plataforma</w:t>
+      </w:r>
+    </w:p>
+    <w:p>
+      <w:pPr>
+        <w:rPr>
+          <w:sz w:val="24"/>
+          <w:szCs w:val="24"/>
+          <w:lang w:val="es-MX"/>
+        </w:rPr>
+      </w:pPr>
+    </w:p>
+    <w:p>
+      <w:pPr>
+        <w:rPr>
+          <w:sz w:val="24"/>
+          <w:szCs w:val="24"/>
+          <w:lang w:val="es-MX"/>
+        </w:rPr>
+      </w:pPr>
+    </w:p>
+    <w:p>
+      <w:pPr>
+        <w:rPr>
+          <w:sz w:val="24"/>
+          <w:szCs w:val="24"/>
+          <w:lang w:val="es-MX"/>
+        </w:rPr>
+      </w:pPr>
+      <w:r>
+        <w:rPr>
+          <w:sz w:val="24"/>
+          <w:szCs w:val="24"/>
+          <w:lang w:val="es-MX"/>
+        </w:rPr>
+        <w:t>Aquí una muestra de las capturas durante el proceso de la instalación, conexión y subida de la db al servidor</w:t>
       </w:r>
     </w:p>
     <w:sectPr>

</xml_diff>